<commit_message>
Update report pipeline documentation and outputs
</commit_message>
<xml_diff>
--- a/OECD-Reports/260416_Diagnosis report_Malta Part 1.docx
+++ b/OECD-Reports/260416_Diagnosis report_Malta Part 1.docx
@@ -79,11 +79,13 @@
     <w:sdt>
       <w:sdtPr>
         <w:rPr>
+          <w:rFonts w:asciiTheme="minorHAnsi" w:eastAsiaTheme="majorEastAsia" w:hAnsiTheme="minorHAnsi" w:cstheme="majorBidi"/>
           <w:b/>
           <w:bCs/>
+          <w:color w:val="4E81BD" w:themeColor="accent1"/>
           <w:sz w:val="52"/>
           <w:szCs w:val="52"/>
-          <w:lang w:val="en-GB"/>
+          <w:lang w:val="en-GB" w:eastAsia="en-US"/>
         </w:rPr>
         <w:id w:val="465552089"/>
         <w:docPartObj>
@@ -93,10 +95,7 @@
       </w:sdtPr>
       <w:sdtEndPr>
         <w:rPr>
-          <w:rFonts w:asciiTheme="minorHAnsi" w:eastAsiaTheme="majorEastAsia" w:hAnsiTheme="minorHAnsi" w:cstheme="majorBidi"/>
-          <w:color w:val="4E81BD" w:themeColor="accent1"/>
           <w:sz w:val="24"/>
-          <w:lang w:eastAsia="en-US"/>
         </w:rPr>
       </w:sdtEndPr>
       <w:sdtContent>
@@ -253,6 +252,7 @@
             </w:rPr>
             <w:t xml:space="preserve">24IE07 </w:t>
           </w:r>
+          <w:proofErr w:type="gramStart"/>
           <w:r>
             <w:rPr>
               <w:rStyle w:val="normaltextrun"/>
@@ -286,6 +286,7 @@
             </w:rPr>
             <w:t>24</w:t>
           </w:r>
+          <w:proofErr w:type="gramEnd"/>
           <w:r>
             <w:rPr>
               <w:rStyle w:val="normaltextrun"/>
@@ -295,7 +296,55 @@
               <w:szCs w:val="26"/>
               <w:lang w:val="en-GB"/>
             </w:rPr>
-            <w:t>IT38  |  24MT03  |  24NL05 </w:t>
+            <w:t>IT</w:t>
+          </w:r>
+          <w:proofErr w:type="gramStart"/>
+          <w:r>
+            <w:rPr>
+              <w:rStyle w:val="normaltextrun"/>
+              <w:rFonts w:asciiTheme="majorHAnsi" w:eastAsiaTheme="majorEastAsia" w:hAnsiTheme="majorHAnsi" w:cs="Segoe UI"/>
+              <w:color w:val="2B579A"/>
+              <w:sz w:val="26"/>
+              <w:szCs w:val="26"/>
+              <w:lang w:val="en-GB"/>
+            </w:rPr>
+            <w:t>38  |</w:t>
+          </w:r>
+          <w:proofErr w:type="gramEnd"/>
+          <w:r>
+            <w:rPr>
+              <w:rStyle w:val="normaltextrun"/>
+              <w:rFonts w:asciiTheme="majorHAnsi" w:eastAsiaTheme="majorEastAsia" w:hAnsiTheme="majorHAnsi" w:cs="Segoe UI"/>
+              <w:color w:val="2B579A"/>
+              <w:sz w:val="26"/>
+              <w:szCs w:val="26"/>
+              <w:lang w:val="en-GB"/>
+            </w:rPr>
+            <w:t>  24MT</w:t>
+          </w:r>
+          <w:proofErr w:type="gramStart"/>
+          <w:r>
+            <w:rPr>
+              <w:rStyle w:val="normaltextrun"/>
+              <w:rFonts w:asciiTheme="majorHAnsi" w:eastAsiaTheme="majorEastAsia" w:hAnsiTheme="majorHAnsi" w:cs="Segoe UI"/>
+              <w:color w:val="2B579A"/>
+              <w:sz w:val="26"/>
+              <w:szCs w:val="26"/>
+              <w:lang w:val="en-GB"/>
+            </w:rPr>
+            <w:t>03  |</w:t>
+          </w:r>
+          <w:proofErr w:type="gramEnd"/>
+          <w:r>
+            <w:rPr>
+              <w:rStyle w:val="normaltextrun"/>
+              <w:rFonts w:asciiTheme="majorHAnsi" w:eastAsiaTheme="majorEastAsia" w:hAnsiTheme="majorHAnsi" w:cs="Segoe UI"/>
+              <w:color w:val="2B579A"/>
+              <w:sz w:val="26"/>
+              <w:szCs w:val="26"/>
+              <w:lang w:val="en-GB"/>
+            </w:rPr>
+            <w:t>  24NL05 </w:t>
           </w:r>
           <w:r>
             <w:rPr>
@@ -376,39 +425,32 @@
             <w:pStyle w:val="Heading2"/>
           </w:pPr>
           <w:r>
+            <w:lastRenderedPageBreak/>
             <w:t xml:space="preserve">1. </w:t>
           </w:r>
           <w:r>
             <w:t>Understanding people’s l</w:t>
           </w:r>
           <w:r>
-            <w:t xml:space="preserve">egal needs and justice </w:t>
-          </w:r>
-          <w:bookmarkStart w:id="0" w:name="_Ref224822761" w:displacedByCustomXml="prev"/>
-          <w:bookmarkStart w:id="1" w:name="_Ref224822781" w:displacedByCustomXml="prev"/>
-          <w:bookmarkStart w:id="2" w:name="_Ref224822803" w:displacedByCustomXml="prev"/>
-          <w:r>
-            <w:t>problem</w:t>
-          </w:r>
+            <w:t>egal needs and justice</w:t>
+          </w:r>
+          <w:bookmarkStart w:id="0" w:name="_Ref224822761"/>
+          <w:bookmarkStart w:id="1" w:name="_Ref224822781"/>
+          <w:bookmarkStart w:id="2" w:name="_Ref224822803"/>
+          <w:r>
+            <w:t xml:space="preserve"> problem</w:t>
+          </w:r>
+          <w:bookmarkStart w:id="3" w:name="_Toc228355200"/>
           <w:r>
             <w:t>s</w:t>
           </w:r>
-          <w:bookmarkStart w:id="3" w:name="_Toc228355200" w:displacedByCustomXml="prev"/>
         </w:p>
       </w:sdtContent>
     </w:sdt>
     <w:bookmarkEnd w:id="3" w:displacedByCustomXml="prev"/>
-    <w:bookmarkStart w:id="4" w:name="_Toc228355200" w:displacedByCustomXml="prev"/>
-    <w:bookmarkEnd w:id="4" w:displacedByCustomXml="prev"/>
     <w:bookmarkEnd w:id="2" w:displacedByCustomXml="prev"/>
-    <w:bookmarkStart w:id="5" w:name="_Ref224822803" w:displacedByCustomXml="prev"/>
-    <w:bookmarkEnd w:id="5" w:displacedByCustomXml="prev"/>
     <w:bookmarkEnd w:id="1" w:displacedByCustomXml="prev"/>
-    <w:bookmarkStart w:id="6" w:name="_Ref224822781" w:displacedByCustomXml="prev"/>
-    <w:bookmarkEnd w:id="6" w:displacedByCustomXml="prev"/>
     <w:bookmarkEnd w:id="0" w:displacedByCustomXml="prev"/>
-    <w:bookmarkStart w:id="7" w:name="_Ref224822761" w:displacedByCustomXml="prev"/>
-    <w:bookmarkEnd w:id="7" w:displacedByCustomXml="prev"/>
     <w:p>
       <w:pPr>
         <w:pStyle w:val="Para0"/>
@@ -437,11 +479,19 @@
         </w:rPr>
         <w:t xml:space="preserve"> their strongest when they reflect the needs of the people they serve. </w:t>
       </w:r>
-      <w:r>
-        <w:rPr>
-          <w:lang w:val="en-US"/>
-        </w:rPr>
-        <w:t>Similar to other countries, in</w:t>
+      <w:proofErr w:type="gramStart"/>
+      <w:r>
+        <w:rPr>
+          <w:lang w:val="en-US"/>
+        </w:rPr>
+        <w:t>Similar to</w:t>
+      </w:r>
+      <w:proofErr w:type="gramEnd"/>
+      <w:r>
+        <w:rPr>
+          <w:lang w:val="en-US"/>
+        </w:rPr>
+        <w:t xml:space="preserve"> other countries, in</w:t>
       </w:r>
       <w:r>
         <w:rPr>
@@ -524,7 +574,21 @@
         <w:rPr>
           <w:lang w:val="en-US"/>
         </w:rPr>
-        <w:t xml:space="preserve">To identify the justice problems people </w:t>
+        <w:t xml:space="preserve">To identify the justice problems </w:t>
+      </w:r>
+      <w:proofErr w:type="gramStart"/>
+      <w:r>
+        <w:rPr>
+          <w:lang w:val="en-US"/>
+        </w:rPr>
+        <w:t>people</w:t>
+      </w:r>
+      <w:proofErr w:type="gramEnd"/>
+      <w:r>
+        <w:rPr>
+          <w:lang w:val="en-US"/>
+        </w:rPr>
+        <w:t xml:space="preserve"> </w:t>
       </w:r>
       <w:r>
         <w:rPr>
@@ -911,24 +975,44 @@
         </w:rPr>
         <w:t>The reported justice problems arise across a variety of areas: people most often face issues related to consumer protection (2</w:t>
       </w:r>
-      <w:r>
-        <w:rPr>
-          <w:lang w:val="en-US"/>
-        </w:rPr>
-        <w:t>4</w:t>
-      </w:r>
+      <w:ins w:id="4" w:author="Angel David Ramirez Romero" w:date="2026-06-10T13:47:00Z" w16du:dateUtc="2026-06-10T17:47:00Z">
+        <w:r>
+          <w:rPr>
+            <w:lang w:val="en-US"/>
+          </w:rPr>
+          <w:t>3</w:t>
+        </w:r>
+      </w:ins>
+      <w:del w:id="5" w:author="Angel David Ramirez Romero" w:date="2026-06-10T13:47:00Z" w16du:dateUtc="2026-06-10T17:47:00Z">
+        <w:r>
+          <w:rPr>
+            <w:lang w:val="en-US"/>
+          </w:rPr>
+          <w:delText>4</w:delText>
+        </w:r>
+      </w:del>
       <w:r>
         <w:rPr>
           <w:lang w:val="en-US"/>
         </w:rPr>
         <w:t>%), public services (1</w:t>
       </w:r>
-      <w:r>
-        <w:rPr>
-          <w:lang w:val="en-US"/>
-        </w:rPr>
-        <w:t>7</w:t>
-      </w:r>
+      <w:ins w:id="6" w:author="Angel David Ramirez Romero" w:date="2026-06-10T13:48:00Z" w16du:dateUtc="2026-06-10T17:48:00Z">
+        <w:r>
+          <w:rPr>
+            <w:lang w:val="en-US"/>
+          </w:rPr>
+          <w:t>6</w:t>
+        </w:r>
+      </w:ins>
+      <w:del w:id="7" w:author="Angel David Ramirez Romero" w:date="2026-06-10T13:48:00Z" w16du:dateUtc="2026-06-10T17:48:00Z">
+        <w:r>
+          <w:rPr>
+            <w:lang w:val="en-US"/>
+          </w:rPr>
+          <w:delText>7</w:delText>
+        </w:r>
+      </w:del>
       <w:r>
         <w:rPr>
           <w:lang w:val="en-US"/>
@@ -939,7 +1023,29 @@
         <w:rPr>
           <w:lang w:val="en-US"/>
         </w:rPr>
-        <w:t xml:space="preserve">land (12%), </w:t>
+        <w:t>land (1</w:t>
+      </w:r>
+      <w:ins w:id="8" w:author="Angel David Ramirez Romero" w:date="2026-06-10T13:48:00Z" w16du:dateUtc="2026-06-10T17:48:00Z">
+        <w:r>
+          <w:rPr>
+            <w:lang w:val="en-US"/>
+          </w:rPr>
+          <w:t>2</w:t>
+        </w:r>
+      </w:ins>
+      <w:del w:id="9" w:author="Angel David Ramirez Romero" w:date="2026-06-10T13:48:00Z" w16du:dateUtc="2026-06-10T17:48:00Z">
+        <w:r>
+          <w:rPr>
+            <w:lang w:val="en-US"/>
+          </w:rPr>
+          <w:delText>2</w:delText>
+        </w:r>
+      </w:del>
+      <w:r>
+        <w:rPr>
+          <w:lang w:val="en-US"/>
+        </w:rPr>
+        <w:t xml:space="preserve">%), </w:t>
       </w:r>
       <w:r>
         <w:rPr>
@@ -1363,7 +1469,7 @@
       <w:pPr>
         <w:pStyle w:val="Caption"/>
       </w:pPr>
-      <w:bookmarkStart w:id="8" w:name="_Toc228959126"/>
+      <w:bookmarkStart w:id="10" w:name="_Toc228959126"/>
       <w:r>
         <w:t>Figure </w:t>
       </w:r>
@@ -1439,7 +1545,7 @@
         </w:rPr>
         <w:t>Prevalence of serious justice problems in Malta, by problem category</w:t>
       </w:r>
-      <w:bookmarkEnd w:id="8"/>
+      <w:bookmarkEnd w:id="10"/>
     </w:p>
     <w:p>
       <w:pPr>
@@ -1448,44 +1554,96 @@
           <w:i/>
         </w:rPr>
       </w:pPr>
-      <w:r>
-        <w:rPr>
-          <w:noProof/>
-        </w:rPr>
-        <w:drawing>
-          <wp:inline distT="0" distB="0" distL="0" distR="0" wp14:anchorId="328E933A" wp14:editId="70F00998">
-            <wp:extent cx="5308600" cy="2476500"/>
-            <wp:effectExtent l="0" t="0" r="0" b="0"/>
-            <wp:docPr id="621233522" name="Picture 10"/>
-            <wp:cNvGraphicFramePr/>
-            <a:graphic xmlns:a="http://schemas.openxmlformats.org/drawingml/2006/main">
-              <a:graphicData uri="http://schemas.openxmlformats.org/drawingml/2006/picture">
-                <pic:pic xmlns:pic="http://schemas.openxmlformats.org/drawingml/2006/picture">
-                  <pic:nvPicPr>
-                    <pic:cNvPr id="621233522" name="Picture 10"/>
-                    <pic:cNvPicPr/>
-                  </pic:nvPicPr>
-                  <pic:blipFill>
-                    <a:blip r:embed="rId12"/>
-                    <a:stretch>
-                      <a:fillRect/>
-                    </a:stretch>
-                  </pic:blipFill>
-                  <pic:spPr>
-                    <a:xfrm>
-                      <a:off x="0" y="0"/>
-                      <a:ext cx="5308600" cy="2476500"/>
-                    </a:xfrm>
-                    <a:prstGeom prst="rect">
-                      <a:avLst/>
-                    </a:prstGeom>
-                  </pic:spPr>
-                </pic:pic>
-              </a:graphicData>
-            </a:graphic>
-          </wp:inline>
-        </w:drawing>
-      </w:r>
+      <w:del w:id="11" w:author="Angel David Ramirez Romero" w:date="2026-06-10T14:19:00Z" w16du:dateUtc="2026-06-10T18:19:00Z">
+        <w:r>
+          <w:rPr>
+            <w:noProof/>
+          </w:rPr>
+          <w:drawing>
+            <wp:inline distT="0" distB="0" distL="0" distR="0" wp14:anchorId="328E933A" wp14:editId="2228F98D">
+              <wp:extent cx="5308600" cy="2476500"/>
+              <wp:effectExtent l="0" t="0" r="0" b="0"/>
+              <wp:docPr id="621233522" name="Picture 10"/>
+              <wp:cNvGraphicFramePr/>
+              <a:graphic xmlns:a="http://schemas.openxmlformats.org/drawingml/2006/main">
+                <a:graphicData uri="http://schemas.openxmlformats.org/drawingml/2006/picture">
+                  <pic:pic xmlns:pic="http://schemas.openxmlformats.org/drawingml/2006/picture">
+                    <pic:nvPicPr>
+                      <pic:cNvPr id="621233522" name="Picture 10"/>
+                      <pic:cNvPicPr/>
+                    </pic:nvPicPr>
+                    <pic:blipFill>
+                      <a:blip r:embed="rId12"/>
+                      <a:stretch>
+                        <a:fillRect/>
+                      </a:stretch>
+                    </pic:blipFill>
+                    <pic:spPr>
+                      <a:xfrm>
+                        <a:off x="0" y="0"/>
+                        <a:ext cx="5308600" cy="2476500"/>
+                      </a:xfrm>
+                      <a:prstGeom prst="rect">
+                        <a:avLst/>
+                      </a:prstGeom>
+                    </pic:spPr>
+                  </pic:pic>
+                </a:graphicData>
+              </a:graphic>
+            </wp:inline>
+          </w:drawing>
+        </w:r>
+      </w:del>
+      <w:ins w:id="12" w:author="Angel David Ramirez Romero" w:date="2026-06-10T14:19:00Z" w16du:dateUtc="2026-06-10T18:19:00Z">
+        <w:r>
+          <w:rPr>
+            <w:i/>
+            <w:noProof/>
+            <w:lang w:val="en-GB"/>
+          </w:rPr>
+          <w:drawing>
+            <wp:inline distT="0" distB="0" distL="0" distR="0" wp14:anchorId="518AA8DA" wp14:editId="4F7CA250">
+              <wp:extent cx="3882390" cy="1969477"/>
+              <wp:effectExtent l="0" t="0" r="3810" b="0"/>
+              <wp:docPr id="1895211509" name="Picture 7"/>
+              <wp:cNvGraphicFramePr>
+                <a:graphicFrameLocks xmlns:a="http://schemas.openxmlformats.org/drawingml/2006/main" noChangeAspect="1"/>
+              </wp:cNvGraphicFramePr>
+              <a:graphic xmlns:a="http://schemas.openxmlformats.org/drawingml/2006/main">
+                <a:graphicData uri="http://schemas.openxmlformats.org/drawingml/2006/picture">
+                  <pic:pic xmlns:pic="http://schemas.openxmlformats.org/drawingml/2006/picture">
+                    <pic:nvPicPr>
+                      <pic:cNvPr id="1895211509" name="Picture 1895211509"/>
+                      <pic:cNvPicPr/>
+                    </pic:nvPicPr>
+                    <pic:blipFill>
+                      <a:blip r:embed="rId13" cstate="print">
+                        <a:extLst>
+                          <a:ext uri="{28A0092B-C50C-407E-A947-70E740481C1C}">
+                            <a14:useLocalDpi xmlns:a14="http://schemas.microsoft.com/office/drawing/2010/main" val="0"/>
+                          </a:ext>
+                        </a:extLst>
+                      </a:blip>
+                      <a:stretch>
+                        <a:fillRect/>
+                      </a:stretch>
+                    </pic:blipFill>
+                    <pic:spPr>
+                      <a:xfrm>
+                        <a:off x="0" y="0"/>
+                        <a:ext cx="3925813" cy="1991505"/>
+                      </a:xfrm>
+                      <a:prstGeom prst="rect">
+                        <a:avLst/>
+                      </a:prstGeom>
+                    </pic:spPr>
+                  </pic:pic>
+                </a:graphicData>
+              </a:graphic>
+            </wp:inline>
+          </w:drawing>
+        </w:r>
+      </w:ins>
     </w:p>
     <w:p>
       <w:pPr>
@@ -1499,7 +1657,23 @@
           <w:rFonts w:ascii="Arial Narrow" w:eastAsia="Times New Roman" w:hAnsi="Arial Narrow" w:cs="Segoe UI"/>
           <w:lang w:val="en-US"/>
         </w:rPr>
-        <w:t>Percentage of respondents who experienced at least one serious justice problem in the past two years by problem category. Data are rounded up to the nearest whole number</w:t>
+        <w:t xml:space="preserve">Percentage of respondents who experienced at least one serious justice problem in the past two years by problem category. Data are rounded </w:t>
+      </w:r>
+      <w:del w:id="13" w:author="Santiago Pardo" w:date="2026-06-10T18:30:00Z" w16du:dateUtc="2026-06-10T23:30:00Z">
+        <w:r>
+          <w:rPr>
+            <w:rFonts w:ascii="Arial Narrow" w:eastAsia="Times New Roman" w:hAnsi="Arial Narrow" w:cs="Segoe UI"/>
+            <w:lang w:val="en-US"/>
+          </w:rPr>
+          <w:delText xml:space="preserve">up </w:delText>
+        </w:r>
+      </w:del>
+      <w:r>
+        <w:rPr>
+          <w:rFonts w:ascii="Arial Narrow" w:eastAsia="Times New Roman" w:hAnsi="Arial Narrow" w:cs="Segoe UI"/>
+          <w:lang w:val="en-US"/>
+        </w:rPr>
+        <w:t>to the nearest whole number</w:t>
       </w:r>
     </w:p>
     <w:p>
@@ -1618,8 +1792,16 @@
         <w:rPr>
           <w:lang w:val="en-US"/>
         </w:rPr>
-        <w:t>the prevalence of justice problems within  society</w:t>
-      </w:r>
+        <w:t xml:space="preserve">the prevalence of justice problems </w:t>
+      </w:r>
+      <w:proofErr w:type="gramStart"/>
+      <w:r>
+        <w:rPr>
+          <w:lang w:val="en-US"/>
+        </w:rPr>
+        <w:t>within  society</w:t>
+      </w:r>
+      <w:proofErr w:type="gramEnd"/>
       <w:r>
         <w:rPr>
           <w:lang w:val="en-US"/>
@@ -1692,12 +1874,22 @@
         </w:rPr>
         <w:t xml:space="preserve"> justice problems at higher rates than women (4</w:t>
       </w:r>
-      <w:r>
-        <w:rPr>
-          <w:lang w:val="en-US"/>
-        </w:rPr>
-        <w:t>9</w:t>
-      </w:r>
+      <w:ins w:id="14" w:author="Angel David Ramirez Romero" w:date="2026-06-10T13:49:00Z" w16du:dateUtc="2026-06-10T17:49:00Z">
+        <w:r>
+          <w:rPr>
+            <w:lang w:val="en-US"/>
+          </w:rPr>
+          <w:t>8</w:t>
+        </w:r>
+      </w:ins>
+      <w:del w:id="15" w:author="Angel David Ramirez Romero" w:date="2026-06-10T13:49:00Z" w16du:dateUtc="2026-06-10T17:49:00Z">
+        <w:r>
+          <w:rPr>
+            <w:lang w:val="en-US"/>
+          </w:rPr>
+          <w:delText>9</w:delText>
+        </w:r>
+      </w:del>
       <w:r>
         <w:rPr>
           <w:lang w:val="en-US"/>
@@ -1716,12 +1908,22 @@
         </w:rPr>
         <w:t>%) and 35-44 (6</w:t>
       </w:r>
-      <w:r>
-        <w:rPr>
-          <w:lang w:val="en-US"/>
-        </w:rPr>
-        <w:t>5</w:t>
-      </w:r>
+      <w:ins w:id="16" w:author="Angel David Ramirez Romero" w:date="2026-06-10T13:49:00Z" w16du:dateUtc="2026-06-10T17:49:00Z">
+        <w:r>
+          <w:rPr>
+            <w:lang w:val="en-US"/>
+          </w:rPr>
+          <w:t>4</w:t>
+        </w:r>
+      </w:ins>
+      <w:del w:id="17" w:author="Angel David Ramirez Romero" w:date="2026-06-10T13:49:00Z" w16du:dateUtc="2026-06-10T17:49:00Z">
+        <w:r>
+          <w:rPr>
+            <w:lang w:val="en-US"/>
+          </w:rPr>
+          <w:delText>5</w:delText>
+        </w:r>
+      </w:del>
       <w:r>
         <w:rPr>
           <w:lang w:val="en-US"/>
@@ -1846,7 +2048,7 @@
       <w:pPr>
         <w:pStyle w:val="Caption"/>
       </w:pPr>
-      <w:bookmarkStart w:id="9" w:name="_Toc228959127"/>
+      <w:bookmarkStart w:id="18" w:name="_Toc228959127"/>
       <w:r>
         <w:lastRenderedPageBreak/>
         <w:t>Figure </w:t>
@@ -1929,7 +2131,7 @@
       <w:r>
         <w:t xml:space="preserve"> in Malta</w:t>
       </w:r>
-      <w:bookmarkEnd w:id="9"/>
+      <w:bookmarkEnd w:id="18"/>
     </w:p>
     <w:p>
       <w:pPr>
@@ -1939,48 +2141,152 @@
           <w:lang w:val="en-GB"/>
         </w:rPr>
       </w:pPr>
-      <w:r>
-        <w:rPr>
-          <w:i/>
-          <w:noProof/>
-          <w:lang w:val="en-GB"/>
-        </w:rPr>
-        <w:drawing>
-          <wp:inline distT="0" distB="0" distL="0" distR="0" wp14:anchorId="2AF48FBC" wp14:editId="29C11FDC">
-            <wp:extent cx="5989113" cy="4942235"/>
-            <wp:effectExtent l="0" t="0" r="0" b="0"/>
-            <wp:docPr id="1622190718" name="Picture 1"/>
-            <wp:cNvGraphicFramePr>
-              <a:graphicFrameLocks xmlns:a="http://schemas.openxmlformats.org/drawingml/2006/main" noChangeAspect="1"/>
-            </wp:cNvGraphicFramePr>
-            <a:graphic xmlns:a="http://schemas.openxmlformats.org/drawingml/2006/main">
-              <a:graphicData uri="http://schemas.openxmlformats.org/drawingml/2006/picture">
-                <pic:pic xmlns:pic="http://schemas.openxmlformats.org/drawingml/2006/picture">
-                  <pic:nvPicPr>
-                    <pic:cNvPr id="1622190718" name="Picture 1"/>
-                    <pic:cNvPicPr/>
-                  </pic:nvPicPr>
-                  <pic:blipFill>
-                    <a:blip r:embed="rId13"/>
-                    <a:stretch>
-                      <a:fillRect/>
-                    </a:stretch>
-                  </pic:blipFill>
-                  <pic:spPr>
-                    <a:xfrm>
-                      <a:off x="0" y="0"/>
-                      <a:ext cx="5989113" cy="4942235"/>
-                    </a:xfrm>
-                    <a:prstGeom prst="rect">
-                      <a:avLst/>
-                    </a:prstGeom>
-                  </pic:spPr>
-                </pic:pic>
-              </a:graphicData>
-            </a:graphic>
-          </wp:inline>
-        </w:drawing>
-      </w:r>
+      <w:del w:id="19" w:author="Angel David Ramirez Romero" w:date="2026-06-10T14:19:00Z" w16du:dateUtc="2026-06-10T18:19:00Z">
+        <w:r>
+          <w:rPr>
+            <w:i/>
+            <w:noProof/>
+            <w:lang w:val="en-GB"/>
+          </w:rPr>
+          <w:drawing>
+            <wp:inline distT="0" distB="0" distL="0" distR="0" wp14:anchorId="2AF48FBC" wp14:editId="11AC4F6A">
+              <wp:extent cx="5989113" cy="4942235"/>
+              <wp:effectExtent l="0" t="0" r="0" b="0"/>
+              <wp:docPr id="1622190718" name="Picture 1"/>
+              <wp:cNvGraphicFramePr>
+                <a:graphicFrameLocks xmlns:a="http://schemas.openxmlformats.org/drawingml/2006/main" noChangeAspect="1"/>
+              </wp:cNvGraphicFramePr>
+              <a:graphic xmlns:a="http://schemas.openxmlformats.org/drawingml/2006/main">
+                <a:graphicData uri="http://schemas.openxmlformats.org/drawingml/2006/picture">
+                  <pic:pic xmlns:pic="http://schemas.openxmlformats.org/drawingml/2006/picture">
+                    <pic:nvPicPr>
+                      <pic:cNvPr id="1622190718" name="Picture 1"/>
+                      <pic:cNvPicPr/>
+                    </pic:nvPicPr>
+                    <pic:blipFill>
+                      <a:blip r:embed="rId14"/>
+                      <a:stretch>
+                        <a:fillRect/>
+                      </a:stretch>
+                    </pic:blipFill>
+                    <pic:spPr>
+                      <a:xfrm>
+                        <a:off x="0" y="0"/>
+                        <a:ext cx="5989113" cy="4942235"/>
+                      </a:xfrm>
+                      <a:prstGeom prst="rect">
+                        <a:avLst/>
+                      </a:prstGeom>
+                    </pic:spPr>
+                  </pic:pic>
+                </a:graphicData>
+              </a:graphic>
+            </wp:inline>
+          </w:drawing>
+        </w:r>
+      </w:del>
+      <w:ins w:id="20" w:author="Angel David Ramirez Romero" w:date="2026-06-10T14:19:00Z" w16du:dateUtc="2026-06-10T18:19:00Z">
+        <w:del w:id="21" w:author="Angel David Ramirez Romero [2]" w:date="2026-06-11T14:56:00Z" w16du:dateUtc="2026-06-11T18:56:00Z">
+          <w:r>
+            <w:rPr>
+              <w:i/>
+              <w:noProof/>
+              <w:lang w:val="en-GB"/>
+            </w:rPr>
+            <w:drawing>
+              <wp:inline distT="0" distB="0" distL="0" distR="0" wp14:anchorId="2DBD8987" wp14:editId="3A6ADF49">
+                <wp:extent cx="4815281" cy="3592040"/>
+                <wp:effectExtent l="0" t="0" r="0" b="0"/>
+                <wp:docPr id="1838322354" name="Picture 9"/>
+                <wp:cNvGraphicFramePr>
+                  <a:graphicFrameLocks xmlns:a="http://schemas.openxmlformats.org/drawingml/2006/main" noChangeAspect="1"/>
+                </wp:cNvGraphicFramePr>
+                <a:graphic xmlns:a="http://schemas.openxmlformats.org/drawingml/2006/main">
+                  <a:graphicData uri="http://schemas.openxmlformats.org/drawingml/2006/picture">
+                    <pic:pic xmlns:pic="http://schemas.openxmlformats.org/drawingml/2006/picture">
+                      <pic:nvPicPr>
+                        <pic:cNvPr id="1838322354" name="Picture 1838322354"/>
+                        <pic:cNvPicPr/>
+                      </pic:nvPicPr>
+                      <pic:blipFill>
+                        <a:blip r:embed="rId15" cstate="print">
+                          <a:extLst>
+                            <a:ext uri="{28A0092B-C50C-407E-A947-70E740481C1C}">
+                              <a14:useLocalDpi xmlns:a14="http://schemas.microsoft.com/office/drawing/2010/main" val="0"/>
+                            </a:ext>
+                          </a:extLst>
+                        </a:blip>
+                        <a:stretch>
+                          <a:fillRect/>
+                        </a:stretch>
+                      </pic:blipFill>
+                      <pic:spPr>
+                        <a:xfrm>
+                          <a:off x="0" y="0"/>
+                          <a:ext cx="4833644" cy="3605738"/>
+                        </a:xfrm>
+                        <a:prstGeom prst="rect">
+                          <a:avLst/>
+                        </a:prstGeom>
+                      </pic:spPr>
+                    </pic:pic>
+                  </a:graphicData>
+                </a:graphic>
+              </wp:inline>
+            </w:drawing>
+          </w:r>
+        </w:del>
+      </w:ins>
+      <w:ins w:id="22" w:author="Angel David Ramirez Romero [2]" w:date="2026-06-11T14:56:00Z" w16du:dateUtc="2026-06-11T18:56:00Z">
+        <w:r>
+          <w:rPr>
+            <w:i/>
+            <w:noProof/>
+            <w:lang w:val="en-GB"/>
+          </w:rPr>
+          <w:drawing>
+            <wp:inline distT="0" distB="0" distL="0" distR="0" wp14:anchorId="55C5D172" wp14:editId="77C17298">
+              <wp:extent cx="4232194" cy="1988820"/>
+              <wp:effectExtent l="0" t="0" r="0" b="5080"/>
+              <wp:docPr id="518571422" name="Picture 5"/>
+              <wp:cNvGraphicFramePr>
+                <a:graphicFrameLocks xmlns:a="http://schemas.openxmlformats.org/drawingml/2006/main" noChangeAspect="1"/>
+              </wp:cNvGraphicFramePr>
+              <a:graphic xmlns:a="http://schemas.openxmlformats.org/drawingml/2006/main">
+                <a:graphicData uri="http://schemas.openxmlformats.org/drawingml/2006/picture">
+                  <pic:pic xmlns:pic="http://schemas.openxmlformats.org/drawingml/2006/picture">
+                    <pic:nvPicPr>
+                      <pic:cNvPr id="518571422" name="Picture 518571422"/>
+                      <pic:cNvPicPr/>
+                    </pic:nvPicPr>
+                    <pic:blipFill>
+                      <a:blip r:embed="rId16" cstate="print">
+                        <a:extLst>
+                          <a:ext uri="{28A0092B-C50C-407E-A947-70E740481C1C}">
+                            <a14:useLocalDpi xmlns:a14="http://schemas.microsoft.com/office/drawing/2010/main" val="0"/>
+                          </a:ext>
+                        </a:extLst>
+                      </a:blip>
+                      <a:stretch>
+                        <a:fillRect/>
+                      </a:stretch>
+                    </pic:blipFill>
+                    <pic:spPr>
+                      <a:xfrm>
+                        <a:off x="0" y="0"/>
+                        <a:ext cx="4243457" cy="1994113"/>
+                      </a:xfrm>
+                      <a:prstGeom prst="rect">
+                        <a:avLst/>
+                      </a:prstGeom>
+                    </pic:spPr>
+                  </pic:pic>
+                </a:graphicData>
+              </a:graphic>
+            </wp:inline>
+          </w:drawing>
+        </w:r>
+      </w:ins>
     </w:p>
     <w:p>
       <w:pPr>
@@ -2032,7 +2338,25 @@
           <w:color w:val="000000"/>
           <w:szCs w:val="18"/>
         </w:rPr>
-        <w:t xml:space="preserve"> rounded up to the nearest whole number</w:t>
+        <w:t xml:space="preserve"> rounded</w:t>
+      </w:r>
+      <w:del w:id="23" w:author="Santiago Pardo" w:date="2026-06-10T18:30:00Z" w16du:dateUtc="2026-06-10T23:30:00Z">
+        <w:r>
+          <w:rPr>
+            <w:rFonts w:ascii="Arial Narrow" w:eastAsia="Times New Roman" w:hAnsi="Arial Narrow" w:cs="Segoe UI"/>
+            <w:color w:val="000000"/>
+            <w:szCs w:val="18"/>
+          </w:rPr>
+          <w:delText xml:space="preserve"> up</w:delText>
+        </w:r>
+      </w:del>
+      <w:r>
+        <w:rPr>
+          <w:rFonts w:ascii="Arial Narrow" w:eastAsia="Times New Roman" w:hAnsi="Arial Narrow" w:cs="Segoe UI"/>
+          <w:color w:val="000000"/>
+          <w:szCs w:val="18"/>
+        </w:rPr>
+        <w:t xml:space="preserve"> to the nearest whole number</w:t>
       </w:r>
       <w:r>
         <w:rPr>
@@ -2160,7 +2484,29 @@
         <w:rPr>
           <w:lang w:val="en-US"/>
         </w:rPr>
-        <w:t xml:space="preserve"> problem deal with around 2.9 issues simultaneously over the two-year reference period.</w:t>
+        <w:t xml:space="preserve"> problem deal with around 2.</w:t>
+      </w:r>
+      <w:ins w:id="24" w:author="Angel David Ramirez Romero" w:date="2026-06-10T13:51:00Z" w16du:dateUtc="2026-06-10T17:51:00Z">
+        <w:r>
+          <w:rPr>
+            <w:lang w:val="en-US"/>
+          </w:rPr>
+          <w:t>8</w:t>
+        </w:r>
+      </w:ins>
+      <w:del w:id="25" w:author="Angel David Ramirez Romero" w:date="2026-06-10T13:51:00Z" w16du:dateUtc="2026-06-10T17:51:00Z">
+        <w:r>
+          <w:rPr>
+            <w:lang w:val="en-US"/>
+          </w:rPr>
+          <w:delText>9</w:delText>
+        </w:r>
+      </w:del>
+      <w:r>
+        <w:rPr>
+          <w:lang w:val="en-US"/>
+        </w:rPr>
+        <w:t xml:space="preserve"> issues simultaneously over the two-year reference period.</w:t>
       </w:r>
       <w:r>
         <w:rPr>
@@ -2193,7 +2539,105 @@
         <w:rPr>
           <w:lang w:val="en-US"/>
         </w:rPr>
-        <w:t>among people aged 35-44 and 25-34, who face an average of 3.4 and 3.3 justice problems respectively, in contrast to those aged 65 and above, whose average is 1.8 during the same period. T</w:t>
+        <w:t xml:space="preserve">among people aged 35-44 and 25-34, who face an average of </w:t>
+      </w:r>
+      <w:ins w:id="26" w:author="Santiago Pardo" w:date="2026-06-10T18:56:00Z" w16du:dateUtc="2026-06-10T23:56:00Z">
+        <w:r>
+          <w:rPr>
+            <w:lang w:val="en-US"/>
+          </w:rPr>
+          <w:t xml:space="preserve">2.9 </w:t>
+        </w:r>
+      </w:ins>
+      <w:del w:id="27" w:author="Santiago Pardo" w:date="2026-06-10T18:56:00Z" w16du:dateUtc="2026-06-10T23:56:00Z">
+        <w:r>
+          <w:rPr>
+            <w:lang w:val="en-US"/>
+          </w:rPr>
+          <w:delText>3.</w:delText>
+        </w:r>
+      </w:del>
+      <w:ins w:id="28" w:author="Angel David Ramirez Romero" w:date="2026-06-10T13:51:00Z" w16du:dateUtc="2026-06-10T17:51:00Z">
+        <w:del w:id="29" w:author="Santiago Pardo" w:date="2026-06-10T18:56:00Z" w16du:dateUtc="2026-06-10T23:56:00Z">
+          <w:r>
+            <w:rPr>
+              <w:lang w:val="en-US"/>
+            </w:rPr>
+            <w:delText>3</w:delText>
+          </w:r>
+        </w:del>
+      </w:ins>
+      <w:del w:id="30" w:author="Santiago Pardo" w:date="2026-06-10T18:56:00Z" w16du:dateUtc="2026-06-10T23:56:00Z">
+        <w:r>
+          <w:rPr>
+            <w:lang w:val="en-US"/>
+          </w:rPr>
+          <w:delText xml:space="preserve">4 </w:delText>
+        </w:r>
+      </w:del>
+      <w:r>
+        <w:rPr>
+          <w:lang w:val="en-US"/>
+        </w:rPr>
+        <w:t xml:space="preserve">and </w:t>
+      </w:r>
+      <w:ins w:id="31" w:author="Santiago Pardo" w:date="2026-06-10T18:56:00Z" w16du:dateUtc="2026-06-10T23:56:00Z">
+        <w:r>
+          <w:rPr>
+            <w:lang w:val="en-US"/>
+          </w:rPr>
+          <w:t>3.3</w:t>
+        </w:r>
+      </w:ins>
+      <w:ins w:id="32" w:author="Angel David Ramirez Romero" w:date="2026-06-10T13:51:00Z" w16du:dateUtc="2026-06-10T17:51:00Z">
+        <w:del w:id="33" w:author="Santiago Pardo" w:date="2026-06-10T18:56:00Z" w16du:dateUtc="2026-06-10T23:56:00Z">
+          <w:r>
+            <w:rPr>
+              <w:lang w:val="en-US"/>
+            </w:rPr>
+            <w:delText>2</w:delText>
+          </w:r>
+        </w:del>
+      </w:ins>
+      <w:del w:id="34" w:author="Angel David Ramirez Romero" w:date="2026-06-10T13:51:00Z" w16du:dateUtc="2026-06-10T17:51:00Z">
+        <w:r>
+          <w:rPr>
+            <w:lang w:val="en-US"/>
+          </w:rPr>
+          <w:delText>3</w:delText>
+        </w:r>
+      </w:del>
+      <w:del w:id="35" w:author="Santiago Pardo" w:date="2026-06-10T18:56:00Z" w16du:dateUtc="2026-06-10T23:56:00Z">
+        <w:r>
+          <w:rPr>
+            <w:lang w:val="en-US"/>
+          </w:rPr>
+          <w:delText>.</w:delText>
+        </w:r>
+      </w:del>
+      <w:ins w:id="36" w:author="Angel David Ramirez Romero" w:date="2026-06-10T13:51:00Z" w16du:dateUtc="2026-06-10T17:51:00Z">
+        <w:del w:id="37" w:author="Santiago Pardo" w:date="2026-06-10T18:56:00Z" w16du:dateUtc="2026-06-10T23:56:00Z">
+          <w:r>
+            <w:rPr>
+              <w:lang w:val="en-US"/>
+            </w:rPr>
+            <w:delText>9</w:delText>
+          </w:r>
+        </w:del>
+      </w:ins>
+      <w:del w:id="38" w:author="Angel David Ramirez Romero" w:date="2026-06-10T13:51:00Z" w16du:dateUtc="2026-06-10T17:51:00Z">
+        <w:r>
+          <w:rPr>
+            <w:lang w:val="en-US"/>
+          </w:rPr>
+          <w:delText>3</w:delText>
+        </w:r>
+      </w:del>
+      <w:r>
+        <w:rPr>
+          <w:lang w:val="en-US"/>
+        </w:rPr>
+        <w:t xml:space="preserve"> justice problems respectively, in contrast to those aged 65 and above, whose average is 1.8 during the same period. T</w:t>
       </w:r>
       <w:r>
         <w:rPr>
@@ -2299,7 +2743,7 @@
       <w:pPr>
         <w:pStyle w:val="Caption"/>
       </w:pPr>
-      <w:bookmarkStart w:id="10" w:name="_Toc228959128"/>
+      <w:bookmarkStart w:id="39" w:name="_Toc228959128"/>
       <w:r>
         <w:t>Figure </w:t>
       </w:r>
@@ -2381,7 +2825,7 @@
       <w:r>
         <w:t>Malta</w:t>
       </w:r>
-      <w:bookmarkEnd w:id="10"/>
+      <w:bookmarkEnd w:id="39"/>
     </w:p>
     <w:p>
       <w:pPr>
@@ -2390,44 +2834,146 @@
           <w:i/>
         </w:rPr>
       </w:pPr>
-      <w:r>
-        <w:rPr>
-          <w:noProof/>
-        </w:rPr>
-        <w:drawing>
-          <wp:inline distT="0" distB="0" distL="0" distR="0" wp14:anchorId="341155AD" wp14:editId="11D8E7A7">
-            <wp:extent cx="6531175" cy="5053253"/>
-            <wp:effectExtent l="0" t="0" r="0" b="0"/>
-            <wp:docPr id="2117489654" name="Picture 10"/>
-            <wp:cNvGraphicFramePr/>
-            <a:graphic xmlns:a="http://schemas.openxmlformats.org/drawingml/2006/main">
-              <a:graphicData uri="http://schemas.openxmlformats.org/drawingml/2006/picture">
-                <pic:pic xmlns:pic="http://schemas.openxmlformats.org/drawingml/2006/picture">
-                  <pic:nvPicPr>
-                    <pic:cNvPr id="2117489654" name="Picture 10"/>
-                    <pic:cNvPicPr/>
-                  </pic:nvPicPr>
-                  <pic:blipFill>
-                    <a:blip r:embed="rId14"/>
-                    <a:stretch>
-                      <a:fillRect/>
-                    </a:stretch>
-                  </pic:blipFill>
-                  <pic:spPr>
-                    <a:xfrm>
-                      <a:off x="0" y="0"/>
-                      <a:ext cx="6531175" cy="5053253"/>
-                    </a:xfrm>
-                    <a:prstGeom prst="rect">
-                      <a:avLst/>
-                    </a:prstGeom>
-                  </pic:spPr>
-                </pic:pic>
-              </a:graphicData>
-            </a:graphic>
-          </wp:inline>
-        </w:drawing>
-      </w:r>
+      <w:del w:id="40" w:author="Angel David Ramirez Romero" w:date="2026-06-10T14:20:00Z" w16du:dateUtc="2026-06-10T18:20:00Z">
+        <w:r>
+          <w:rPr>
+            <w:noProof/>
+          </w:rPr>
+          <w:drawing>
+            <wp:inline distT="0" distB="0" distL="0" distR="0" wp14:anchorId="341155AD" wp14:editId="1AB50E89">
+              <wp:extent cx="4530204" cy="2823845"/>
+              <wp:effectExtent l="0" t="0" r="0" b="0"/>
+              <wp:docPr id="2117489654" name="Picture 10"/>
+              <wp:cNvGraphicFramePr/>
+              <a:graphic xmlns:a="http://schemas.openxmlformats.org/drawingml/2006/main">
+                <a:graphicData uri="http://schemas.openxmlformats.org/drawingml/2006/picture">
+                  <pic:pic xmlns:pic="http://schemas.openxmlformats.org/drawingml/2006/picture">
+                    <pic:nvPicPr>
+                      <pic:cNvPr id="2117489654" name="Picture 10"/>
+                      <pic:cNvPicPr/>
+                    </pic:nvPicPr>
+                    <pic:blipFill>
+                      <a:blip r:embed="rId17"/>
+                      <a:stretch>
+                        <a:fillRect/>
+                      </a:stretch>
+                    </pic:blipFill>
+                    <pic:spPr>
+                      <a:xfrm>
+                        <a:off x="0" y="0"/>
+                        <a:ext cx="4535573" cy="2827192"/>
+                      </a:xfrm>
+                      <a:prstGeom prst="rect">
+                        <a:avLst/>
+                      </a:prstGeom>
+                    </pic:spPr>
+                  </pic:pic>
+                </a:graphicData>
+              </a:graphic>
+            </wp:inline>
+          </w:drawing>
+        </w:r>
+      </w:del>
+      <w:ins w:id="41" w:author="Angel David Ramirez Romero" w:date="2026-06-10T14:20:00Z" w16du:dateUtc="2026-06-10T18:20:00Z">
+        <w:del w:id="42" w:author="Angel David Ramirez Romero [2]" w:date="2026-06-11T14:11:00Z" w16du:dateUtc="2026-06-11T18:11:00Z">
+          <w:r>
+            <w:rPr>
+              <w:i/>
+              <w:noProof/>
+            </w:rPr>
+            <w:drawing>
+              <wp:inline distT="0" distB="0" distL="0" distR="0" wp14:anchorId="77B7711F" wp14:editId="7738582F">
+                <wp:extent cx="4515809" cy="2655736"/>
+                <wp:effectExtent l="0" t="0" r="0" b="0"/>
+                <wp:docPr id="1382092405" name="Picture 10"/>
+                <wp:cNvGraphicFramePr>
+                  <a:graphicFrameLocks xmlns:a="http://schemas.openxmlformats.org/drawingml/2006/main" noChangeAspect="1"/>
+                </wp:cNvGraphicFramePr>
+                <a:graphic xmlns:a="http://schemas.openxmlformats.org/drawingml/2006/main">
+                  <a:graphicData uri="http://schemas.openxmlformats.org/drawingml/2006/picture">
+                    <pic:pic xmlns:pic="http://schemas.openxmlformats.org/drawingml/2006/picture">
+                      <pic:nvPicPr>
+                        <pic:cNvPr id="1382092405" name="Picture 1382092405"/>
+                        <pic:cNvPicPr/>
+                      </pic:nvPicPr>
+                      <pic:blipFill>
+                        <a:blip r:embed="rId18" cstate="print">
+                          <a:extLst>
+                            <a:ext uri="{28A0092B-C50C-407E-A947-70E740481C1C}">
+                              <a14:useLocalDpi xmlns:a14="http://schemas.microsoft.com/office/drawing/2010/main" val="0"/>
+                            </a:ext>
+                          </a:extLst>
+                        </a:blip>
+                        <a:stretch>
+                          <a:fillRect/>
+                        </a:stretch>
+                      </pic:blipFill>
+                      <pic:spPr>
+                        <a:xfrm>
+                          <a:off x="0" y="0"/>
+                          <a:ext cx="4562931" cy="2683449"/>
+                        </a:xfrm>
+                        <a:prstGeom prst="rect">
+                          <a:avLst/>
+                        </a:prstGeom>
+                      </pic:spPr>
+                    </pic:pic>
+                  </a:graphicData>
+                </a:graphic>
+              </wp:inline>
+            </w:drawing>
+          </w:r>
+        </w:del>
+      </w:ins>
+      <w:ins w:id="43" w:author="Angel David Ramirez Romero [2]" w:date="2026-06-11T14:12:00Z" w16du:dateUtc="2026-06-11T18:12:00Z">
+        <w:r>
+          <w:rPr>
+            <w:i/>
+            <w:noProof/>
+          </w:rPr>
+          <w:drawing>
+            <wp:inline distT="0" distB="0" distL="0" distR="0" wp14:anchorId="4B0AE813" wp14:editId="2763A443">
+              <wp:extent cx="4425315" cy="2538401"/>
+              <wp:effectExtent l="0" t="0" r="0" b="0"/>
+              <wp:docPr id="1316322961" name="Picture 4"/>
+              <wp:cNvGraphicFramePr>
+                <a:graphicFrameLocks xmlns:a="http://schemas.openxmlformats.org/drawingml/2006/main" noChangeAspect="1"/>
+              </wp:cNvGraphicFramePr>
+              <a:graphic xmlns:a="http://schemas.openxmlformats.org/drawingml/2006/main">
+                <a:graphicData uri="http://schemas.openxmlformats.org/drawingml/2006/picture">
+                  <pic:pic xmlns:pic="http://schemas.openxmlformats.org/drawingml/2006/picture">
+                    <pic:nvPicPr>
+                      <pic:cNvPr id="1316322961" name="Picture 1316322961"/>
+                      <pic:cNvPicPr/>
+                    </pic:nvPicPr>
+                    <pic:blipFill>
+                      <a:blip r:embed="rId19" cstate="print">
+                        <a:extLst>
+                          <a:ext uri="{28A0092B-C50C-407E-A947-70E740481C1C}">
+                            <a14:useLocalDpi xmlns:a14="http://schemas.microsoft.com/office/drawing/2010/main" val="0"/>
+                          </a:ext>
+                        </a:extLst>
+                      </a:blip>
+                      <a:stretch>
+                        <a:fillRect/>
+                      </a:stretch>
+                    </pic:blipFill>
+                    <pic:spPr>
+                      <a:xfrm>
+                        <a:off x="0" y="0"/>
+                        <a:ext cx="4444780" cy="2549566"/>
+                      </a:xfrm>
+                      <a:prstGeom prst="rect">
+                        <a:avLst/>
+                      </a:prstGeom>
+                    </pic:spPr>
+                  </pic:pic>
+                </a:graphicData>
+              </a:graphic>
+            </wp:inline>
+          </w:drawing>
+        </w:r>
+      </w:ins>
     </w:p>
     <w:p>
       <w:pPr>
@@ -2501,11 +3047,11 @@
       <w:pPr>
         <w:pStyle w:val="Heading3"/>
       </w:pPr>
-      <w:bookmarkStart w:id="11" w:name="_Ref225243187"/>
+      <w:bookmarkStart w:id="44" w:name="_Ref225243187"/>
       <w:r>
         <w:t>Steps in people’s justice pathways</w:t>
       </w:r>
-      <w:bookmarkEnd w:id="11"/>
+      <w:bookmarkEnd w:id="44"/>
       <w:r>
         <w:t> </w:t>
       </w:r>
@@ -2526,7 +3072,6 @@
         <w:pStyle w:val="Heading4"/>
       </w:pPr>
       <w:r>
-        <w:lastRenderedPageBreak/>
         <w:t>Access to information and advice </w:t>
       </w:r>
     </w:p>
@@ -2764,7 +3309,29 @@
         <w:rPr>
           <w:lang w:val="en-US"/>
         </w:rPr>
-        <w:t xml:space="preserve"> (78% compared to 75%). </w:t>
+        <w:t xml:space="preserve"> (7</w:t>
+      </w:r>
+      <w:ins w:id="45" w:author="Angel David Ramirez Romero" w:date="2026-06-10T13:53:00Z" w16du:dateUtc="2026-06-10T17:53:00Z">
+        <w:r>
+          <w:rPr>
+            <w:lang w:val="en-US"/>
+          </w:rPr>
+          <w:t>9</w:t>
+        </w:r>
+      </w:ins>
+      <w:del w:id="46" w:author="Angel David Ramirez Romero" w:date="2026-06-10T13:53:00Z" w16du:dateUtc="2026-06-10T17:53:00Z">
+        <w:r>
+          <w:rPr>
+            <w:lang w:val="en-US"/>
+          </w:rPr>
+          <w:delText>8</w:delText>
+        </w:r>
+      </w:del>
+      <w:r>
+        <w:rPr>
+          <w:lang w:val="en-US"/>
+        </w:rPr>
+        <w:t xml:space="preserve">% compared to 75%). </w:t>
       </w:r>
       <w:r>
         <w:rPr>
@@ -2842,13 +3409,66 @@
         <w:rPr>
           <w:lang w:val="en-US"/>
         </w:rPr>
-        <w:t> are able to obtain help more often than those facing a single issue (</w:t>
-      </w:r>
-      <w:r>
-        <w:rPr>
-          <w:lang w:val="en-US"/>
-        </w:rPr>
-        <w:t xml:space="preserve">81% </w:t>
+        <w:t> </w:t>
+      </w:r>
+      <w:proofErr w:type="gramStart"/>
+      <w:r>
+        <w:rPr>
+          <w:lang w:val="en-US"/>
+        </w:rPr>
+        <w:t xml:space="preserve">are </w:t>
+      </w:r>
+      <w:r>
+        <w:rPr>
+          <w:lang w:val="en-US"/>
+        </w:rPr>
+        <w:lastRenderedPageBreak/>
+        <w:t>able to</w:t>
+      </w:r>
+      <w:proofErr w:type="gramEnd"/>
+      <w:r>
+        <w:rPr>
+          <w:lang w:val="en-US"/>
+        </w:rPr>
+        <w:t> obtain help more often than those facing a single issue (</w:t>
+      </w:r>
+      <w:r>
+        <w:rPr>
+          <w:lang w:val="en-US"/>
+        </w:rPr>
+        <w:t>8</w:t>
+      </w:r>
+      <w:ins w:id="47" w:author="Santiago Pardo" w:date="2026-06-10T18:28:00Z" w16du:dateUtc="2026-06-10T23:28:00Z">
+        <w:r>
+          <w:rPr>
+            <w:lang w:val="en-US"/>
+          </w:rPr>
+          <w:t>1</w:t>
+        </w:r>
+      </w:ins>
+      <w:ins w:id="48" w:author="Angel David Ramirez Romero" w:date="2026-06-10T13:53:00Z" w16du:dateUtc="2026-06-10T17:53:00Z">
+        <w:del w:id="49" w:author="Santiago Pardo" w:date="2026-06-10T18:28:00Z" w16du:dateUtc="2026-06-10T23:28:00Z">
+          <w:r>
+            <w:rPr>
+              <w:lang w:val="en-US"/>
+            </w:rPr>
+            <w:delText>3</w:delText>
+          </w:r>
+        </w:del>
+      </w:ins>
+      <w:del w:id="50" w:author="Angel David Ramirez Romero" w:date="2026-06-10T13:53:00Z" w16du:dateUtc="2026-06-10T17:53:00Z">
+        <w:r>
+          <w:rPr>
+            <w:lang w:val="en-US"/>
+          </w:rPr>
+          <w:delText>1</w:delText>
+        </w:r>
+      </w:del>
+      <w:r>
+        <w:rPr>
+          <w:lang w:val="en-US"/>
+        </w:rPr>
+        <w:t xml:space="preserve">% </w:t>
       </w:r>
       <w:r>
         <w:rPr>
@@ -3008,8 +3628,16 @@
         <w:rPr>
           <w:lang w:val="en-US"/>
         </w:rPr>
-        <w:t>are more likely to come into contact with</w:t>
-      </w:r>
+        <w:t xml:space="preserve">are more likely to </w:t>
+      </w:r>
+      <w:proofErr w:type="gramStart"/>
+      <w:r>
+        <w:rPr>
+          <w:lang w:val="en-US"/>
+        </w:rPr>
+        <w:t>come into contact with</w:t>
+      </w:r>
+      <w:proofErr w:type="gramEnd"/>
       <w:r>
         <w:rPr>
           <w:lang w:val="en-US"/>
@@ -3096,11 +3724,19 @@
         </w:rPr>
         <w:t xml:space="preserve"> </w:t>
       </w:r>
-      <w:r>
-        <w:rPr>
-          <w:lang w:val="en-US"/>
-        </w:rPr>
-        <w:t>are able to obtain guidance</w:t>
+      <w:proofErr w:type="gramStart"/>
+      <w:r>
+        <w:rPr>
+          <w:lang w:val="en-US"/>
+        </w:rPr>
+        <w:t>are able to</w:t>
+      </w:r>
+      <w:proofErr w:type="gramEnd"/>
+      <w:r>
+        <w:rPr>
+          <w:lang w:val="en-US"/>
+        </w:rPr>
+        <w:t xml:space="preserve"> obtain guidance</w:t>
       </w:r>
       <w:r>
         <w:rPr>
@@ -3254,9 +3890,8 @@
       <w:pPr>
         <w:pStyle w:val="Caption"/>
       </w:pPr>
-      <w:bookmarkStart w:id="12" w:name="_Toc228959129"/>
-      <w:r>
-        <w:lastRenderedPageBreak/>
+      <w:bookmarkStart w:id="51" w:name="_Toc228959129"/>
+      <w:r>
         <w:t>Figure </w:t>
       </w:r>
       <w:r>
@@ -3328,7 +3963,7 @@
       <w:r>
         <w:t>Access to information and advice in Malta</w:t>
       </w:r>
-      <w:bookmarkEnd w:id="12"/>
+      <w:bookmarkEnd w:id="51"/>
     </w:p>
     <w:p>
       <w:pPr>
@@ -3338,45 +3973,148 @@
           <w:lang w:val="en-GB"/>
         </w:rPr>
       </w:pPr>
-      <w:r>
-        <w:rPr>
-          <w:noProof/>
-          <w:lang w:val="en-GB"/>
-        </w:rPr>
-        <w:drawing>
-          <wp:inline distT="0" distB="0" distL="0" distR="0" wp14:anchorId="7BD2CACD" wp14:editId="4A81DCE7">
-            <wp:extent cx="5956498" cy="7368947"/>
-            <wp:effectExtent l="0" t="0" r="0" b="0"/>
-            <wp:docPr id="1719470683" name="Picture 10"/>
-            <wp:cNvGraphicFramePr/>
-            <a:graphic xmlns:a="http://schemas.openxmlformats.org/drawingml/2006/main">
-              <a:graphicData uri="http://schemas.openxmlformats.org/drawingml/2006/picture">
-                <pic:pic xmlns:pic="http://schemas.openxmlformats.org/drawingml/2006/picture">
-                  <pic:nvPicPr>
-                    <pic:cNvPr id="1719470683" name="Picture 10"/>
-                    <pic:cNvPicPr/>
-                  </pic:nvPicPr>
-                  <pic:blipFill>
-                    <a:blip r:embed="rId15"/>
-                    <a:stretch>
-                      <a:fillRect/>
-                    </a:stretch>
-                  </pic:blipFill>
-                  <pic:spPr>
-                    <a:xfrm>
-                      <a:off x="0" y="0"/>
-                      <a:ext cx="5956498" cy="7368947"/>
-                    </a:xfrm>
-                    <a:prstGeom prst="rect">
-                      <a:avLst/>
-                    </a:prstGeom>
-                  </pic:spPr>
-                </pic:pic>
-              </a:graphicData>
-            </a:graphic>
-          </wp:inline>
-        </w:drawing>
-      </w:r>
+      <w:ins w:id="52" w:author="Angel David Ramirez Romero [2]" w:date="2026-06-11T16:00:00Z" w16du:dateUtc="2026-06-11T20:00:00Z">
+        <w:r>
+          <w:rPr>
+            <w:noProof/>
+            <w:lang w:val="en-GB"/>
+          </w:rPr>
+          <w:drawing>
+            <wp:inline distT="0" distB="0" distL="0" distR="0" wp14:anchorId="0C6D74AB" wp14:editId="3A9287F2">
+              <wp:extent cx="3850883" cy="2906702"/>
+              <wp:effectExtent l="0" t="0" r="0" b="1905"/>
+              <wp:docPr id="451056402" name="Picture 6"/>
+              <wp:cNvGraphicFramePr>
+                <a:graphicFrameLocks xmlns:a="http://schemas.openxmlformats.org/drawingml/2006/main" noChangeAspect="1"/>
+              </wp:cNvGraphicFramePr>
+              <a:graphic xmlns:a="http://schemas.openxmlformats.org/drawingml/2006/main">
+                <a:graphicData uri="http://schemas.openxmlformats.org/drawingml/2006/picture">
+                  <pic:pic xmlns:pic="http://schemas.openxmlformats.org/drawingml/2006/picture">
+                    <pic:nvPicPr>
+                      <pic:cNvPr id="451056402" name="Picture 451056402"/>
+                      <pic:cNvPicPr/>
+                    </pic:nvPicPr>
+                    <pic:blipFill>
+                      <a:blip r:embed="rId20" cstate="print">
+                        <a:extLst>
+                          <a:ext uri="{28A0092B-C50C-407E-A947-70E740481C1C}">
+                            <a14:useLocalDpi xmlns:a14="http://schemas.microsoft.com/office/drawing/2010/main" val="0"/>
+                          </a:ext>
+                        </a:extLst>
+                      </a:blip>
+                      <a:stretch>
+                        <a:fillRect/>
+                      </a:stretch>
+                    </pic:blipFill>
+                    <pic:spPr>
+                      <a:xfrm>
+                        <a:off x="0" y="0"/>
+                        <a:ext cx="3877879" cy="2927079"/>
+                      </a:xfrm>
+                      <a:prstGeom prst="rect">
+                        <a:avLst/>
+                      </a:prstGeom>
+                    </pic:spPr>
+                  </pic:pic>
+                </a:graphicData>
+              </a:graphic>
+            </wp:inline>
+          </w:drawing>
+        </w:r>
+      </w:ins>
+      <w:del w:id="53" w:author="Angel David Ramirez Romero" w:date="2026-06-10T14:20:00Z" w16du:dateUtc="2026-06-10T18:20:00Z">
+        <w:r>
+          <w:rPr>
+            <w:noProof/>
+            <w:lang w:val="en-GB"/>
+          </w:rPr>
+          <w:drawing>
+            <wp:inline distT="0" distB="0" distL="0" distR="0" wp14:anchorId="7BD2CACD" wp14:editId="4F957BB3">
+              <wp:extent cx="5956498" cy="7368947"/>
+              <wp:effectExtent l="0" t="0" r="0" b="0"/>
+              <wp:docPr id="1719470683" name="Picture 10"/>
+              <wp:cNvGraphicFramePr/>
+              <a:graphic xmlns:a="http://schemas.openxmlformats.org/drawingml/2006/main">
+                <a:graphicData uri="http://schemas.openxmlformats.org/drawingml/2006/picture">
+                  <pic:pic xmlns:pic="http://schemas.openxmlformats.org/drawingml/2006/picture">
+                    <pic:nvPicPr>
+                      <pic:cNvPr id="1719470683" name="Picture 10"/>
+                      <pic:cNvPicPr/>
+                    </pic:nvPicPr>
+                    <pic:blipFill>
+                      <a:blip r:embed="rId21"/>
+                      <a:stretch>
+                        <a:fillRect/>
+                      </a:stretch>
+                    </pic:blipFill>
+                    <pic:spPr>
+                      <a:xfrm>
+                        <a:off x="0" y="0"/>
+                        <a:ext cx="5956498" cy="7368947"/>
+                      </a:xfrm>
+                      <a:prstGeom prst="rect">
+                        <a:avLst/>
+                      </a:prstGeom>
+                    </pic:spPr>
+                  </pic:pic>
+                </a:graphicData>
+              </a:graphic>
+            </wp:inline>
+          </w:drawing>
+        </w:r>
+      </w:del>
+      <w:ins w:id="54" w:author="Angel David Ramirez Romero" w:date="2026-06-10T14:20:00Z" w16du:dateUtc="2026-06-10T18:20:00Z">
+        <w:del w:id="55" w:author="Angel David Ramirez Romero [2]" w:date="2026-06-11T15:59:00Z" w16du:dateUtc="2026-06-11T19:59:00Z">
+          <w:r>
+            <w:rPr>
+              <w:i/>
+              <w:noProof/>
+              <w:lang w:val="en-GB"/>
+            </w:rPr>
+            <w:drawing>
+              <wp:inline distT="0" distB="0" distL="0" distR="0" wp14:anchorId="5D8CF731" wp14:editId="3BFD1A49">
+                <wp:extent cx="3942715" cy="3562185"/>
+                <wp:effectExtent l="0" t="0" r="0" b="0"/>
+                <wp:docPr id="1167781418" name="Picture 12"/>
+                <wp:cNvGraphicFramePr>
+                  <a:graphicFrameLocks xmlns:a="http://schemas.openxmlformats.org/drawingml/2006/main" noChangeAspect="1"/>
+                </wp:cNvGraphicFramePr>
+                <a:graphic xmlns:a="http://schemas.openxmlformats.org/drawingml/2006/main">
+                  <a:graphicData uri="http://schemas.openxmlformats.org/drawingml/2006/picture">
+                    <pic:pic xmlns:pic="http://schemas.openxmlformats.org/drawingml/2006/picture">
+                      <pic:nvPicPr>
+                        <pic:cNvPr id="1167781418" name="Picture 1167781418"/>
+                        <pic:cNvPicPr/>
+                      </pic:nvPicPr>
+                      <pic:blipFill>
+                        <a:blip r:embed="rId22" cstate="print">
+                          <a:extLst>
+                            <a:ext uri="{28A0092B-C50C-407E-A947-70E740481C1C}">
+                              <a14:useLocalDpi xmlns:a14="http://schemas.microsoft.com/office/drawing/2010/main" val="0"/>
+                            </a:ext>
+                          </a:extLst>
+                        </a:blip>
+                        <a:stretch>
+                          <a:fillRect/>
+                        </a:stretch>
+                      </pic:blipFill>
+                      <pic:spPr>
+                        <a:xfrm>
+                          <a:off x="0" y="0"/>
+                          <a:ext cx="3978430" cy="3594453"/>
+                        </a:xfrm>
+                        <a:prstGeom prst="rect">
+                          <a:avLst/>
+                        </a:prstGeom>
+                      </pic:spPr>
+                    </pic:pic>
+                  </a:graphicData>
+                </a:graphic>
+              </wp:inline>
+            </w:drawing>
+          </w:r>
+        </w:del>
+      </w:ins>
     </w:p>
     <w:p>
       <w:pPr>
@@ -3422,7 +4160,25 @@
           <w:color w:val="000000"/>
           <w:szCs w:val="18"/>
         </w:rPr>
-        <w:t xml:space="preserve"> rounded up to the nearest whole number</w:t>
+        <w:t xml:space="preserve"> rounded</w:t>
+      </w:r>
+      <w:del w:id="56" w:author="Santiago Pardo" w:date="2026-06-10T18:30:00Z" w16du:dateUtc="2026-06-10T23:30:00Z">
+        <w:r>
+          <w:rPr>
+            <w:rFonts w:ascii="Arial Narrow" w:eastAsia="Times New Roman" w:hAnsi="Arial Narrow" w:cs="Segoe UI"/>
+            <w:color w:val="000000"/>
+            <w:szCs w:val="18"/>
+          </w:rPr>
+          <w:delText xml:space="preserve"> up</w:delText>
+        </w:r>
+      </w:del>
+      <w:r>
+        <w:rPr>
+          <w:rFonts w:ascii="Arial Narrow" w:eastAsia="Times New Roman" w:hAnsi="Arial Narrow" w:cs="Segoe UI"/>
+          <w:color w:val="000000"/>
+          <w:szCs w:val="18"/>
+        </w:rPr>
+        <w:t xml:space="preserve"> to the nearest whole number</w:t>
       </w:r>
       <w:r>
         <w:rPr>
@@ -3595,25 +4351,203 @@
         <w:rPr>
           <w:lang w:val="en-US"/>
         </w:rPr>
-        <w:t> not reach out to anyone. Among those who do not seek support, three in five people consider professional help unnecessary (</w:t>
-      </w:r>
-      <w:r>
-        <w:rPr>
-          <w:lang w:val="en-US"/>
-        </w:rPr>
-        <w:t>30</w:t>
-      </w:r>
-      <w:r>
-        <w:rPr>
-          <w:lang w:val="en-US"/>
-        </w:rPr>
-        <w:t>%</w:t>
-      </w:r>
-      <w:r>
-        <w:rPr>
-          <w:lang w:val="en-US"/>
-        </w:rPr>
-        <w:t>), yet two in five indicate that they do need assistance but are unable</w:t>
+        <w:t xml:space="preserve"> not reach out to anyone. </w:t>
+      </w:r>
+      <w:ins w:id="57" w:author="Santiago Pardo" w:date="2026-06-10T19:02:00Z" w16du:dateUtc="2026-06-11T00:02:00Z">
+        <w:r>
+          <w:rPr>
+            <w:lang w:val="en-US"/>
+          </w:rPr>
+          <w:t>Half did not contact an adviser: 30% of all respondents did not consider assistance necessary</w:t>
+        </w:r>
+        <w:r>
+          <w:rPr>
+            <w:lang w:val="en-US"/>
+          </w:rPr>
+          <w:t>,</w:t>
+        </w:r>
+        <w:r>
+          <w:rPr>
+            <w:lang w:val="en-US"/>
+          </w:rPr>
+          <w:t xml:space="preserve"> and 20% needed assistance but could not obtain it.</w:t>
+        </w:r>
+        <w:r>
+          <w:rPr>
+            <w:lang w:val="en-US"/>
+          </w:rPr>
+          <w:t xml:space="preserve"> </w:t>
+        </w:r>
+      </w:ins>
+      <w:del w:id="58" w:author="Santiago Pardo" w:date="2026-06-10T19:02:00Z" w16du:dateUtc="2026-06-11T00:02:00Z">
+        <w:r>
+          <w:rPr>
+            <w:lang w:val="en-US"/>
+          </w:rPr>
+          <w:delText>Among those who do not seek support, three in five people consider professional help unnecessary (</w:delText>
+        </w:r>
+        <w:r>
+          <w:rPr>
+            <w:lang w:val="en-US"/>
+          </w:rPr>
+          <w:delText>30</w:delText>
+        </w:r>
+        <w:r>
+          <w:rPr>
+            <w:lang w:val="en-US"/>
+          </w:rPr>
+          <w:delText>%</w:delText>
+        </w:r>
+        <w:r>
+          <w:rPr>
+            <w:lang w:val="en-US"/>
+          </w:rPr>
+          <w:delText>), yet two in five indicate that they do need assistance but are unable</w:delText>
+        </w:r>
+        <w:r>
+          <w:rPr>
+            <w:lang w:val="en-US"/>
+          </w:rPr>
+          <w:delText xml:space="preserve"> </w:delText>
+        </w:r>
+        <w:r>
+          <w:rPr>
+            <w:lang w:val="en-US"/>
+          </w:rPr>
+          <w:delText>to</w:delText>
+        </w:r>
+        <w:r>
+          <w:rPr>
+            <w:lang w:val="en-US"/>
+          </w:rPr>
+          <w:delText xml:space="preserve"> </w:delText>
+        </w:r>
+        <w:r>
+          <w:rPr>
+            <w:lang w:val="en-US"/>
+          </w:rPr>
+          <w:delText>obtain it due to various barriers (</w:delText>
+        </w:r>
+        <w:r>
+          <w:rPr>
+            <w:lang w:val="en-US"/>
+          </w:rPr>
+          <w:delText>20</w:delText>
+        </w:r>
+        <w:r>
+          <w:rPr>
+            <w:lang w:val="en-US"/>
+          </w:rPr>
+          <w:delText>%)</w:delText>
+        </w:r>
+        <w:r>
+          <w:rPr>
+            <w:lang w:val="en-US"/>
+          </w:rPr>
+          <w:delText>.</w:delText>
+        </w:r>
+        <w:r>
+          <w:rPr>
+            <w:lang w:val="en-US"/>
+          </w:rPr>
+          <w:delText xml:space="preserve"> </w:delText>
+        </w:r>
+      </w:del>
+      <w:r>
+        <w:rPr>
+          <w:lang w:val="en-US"/>
+        </w:rPr>
+        <w:t>A</w:t>
+      </w:r>
+      <w:r>
+        <w:rPr>
+          <w:lang w:val="en-US"/>
+        </w:rPr>
+        <w:t>mong those who do seek advice, most consult an appropriate advisor </w:t>
+      </w:r>
+      <w:r>
+        <w:rPr>
+          <w:lang w:val="en-US"/>
+        </w:rPr>
+        <w:t>(37</w:t>
+      </w:r>
+      <w:del w:id="59" w:author="Angel David Ramirez Romero" w:date="2026-06-10T13:54:00Z" w16du:dateUtc="2026-06-10T17:54:00Z">
+        <w:r>
+          <w:rPr>
+            <w:lang w:val="en-US"/>
+          </w:rPr>
+          <w:delText>.5</w:delText>
+        </w:r>
+      </w:del>
+      <w:r>
+        <w:rPr>
+          <w:lang w:val="en-US"/>
+        </w:rPr>
+        <w:t xml:space="preserve">%), including a lawyer, a professional advisor, an advice service, a government legal aid office, a court or government body, the </w:t>
+      </w:r>
+      <w:r>
+        <w:rPr>
+          <w:lang w:val="en-US"/>
+        </w:rPr>
+        <w:lastRenderedPageBreak/>
+        <w:t xml:space="preserve">police, a </w:t>
+      </w:r>
+      <w:r>
+        <w:rPr>
+          <w:lang w:val="en-US"/>
+        </w:rPr>
+        <w:t xml:space="preserve">health or welfare professional, a trade union or employer, a civil society </w:t>
+      </w:r>
+      <w:proofErr w:type="spellStart"/>
+      <w:r>
+        <w:rPr>
+          <w:lang w:val="en-US"/>
+        </w:rPr>
+        <w:t>organisation</w:t>
+      </w:r>
+      <w:proofErr w:type="spellEnd"/>
+      <w:r>
+        <w:rPr>
+          <w:lang w:val="en-US"/>
+        </w:rPr>
+        <w:t>, a religious or community leader, or a friend or relative with a legal background</w:t>
+      </w:r>
+      <w:r>
+        <w:rPr>
+          <w:lang w:val="en-US"/>
+        </w:rPr>
+        <w:t>.</w:t>
+      </w:r>
+      <w:r>
+        <w:rPr>
+          <w:rStyle w:val="FootnoteReference"/>
+          <w:lang w:val="en-US"/>
+        </w:rPr>
+        <w:footnoteReference w:id="5"/>
+      </w:r>
+      <w:r>
+        <w:rPr>
+          <w:lang w:val="en-US"/>
+        </w:rPr>
+        <w:t> </w:t>
+      </w:r>
+      <w:r>
+        <w:rPr>
+          <w:lang w:val="en-US"/>
+        </w:rPr>
+        <w:t>However</w:t>
+      </w:r>
+      <w:r>
+        <w:rPr>
+          <w:lang w:val="en-US"/>
+        </w:rPr>
+        <w:t>, the remaining </w:t>
+      </w:r>
+      <w:r>
+        <w:rPr>
+          <w:lang w:val="en-US"/>
+        </w:rPr>
+        <w:t>respondents</w:t>
       </w:r>
       <w:r>
         <w:rPr>
@@ -3625,7 +4559,35 @@
         <w:rPr>
           <w:lang w:val="en-US"/>
         </w:rPr>
-        <w:t>to</w:t>
+        <w:t>(1</w:t>
+      </w:r>
+      <w:ins w:id="60" w:author="Angel David Ramirez Romero" w:date="2026-06-10T13:54:00Z" w16du:dateUtc="2026-06-10T17:54:00Z">
+        <w:r>
+          <w:rPr>
+            <w:lang w:val="en-US"/>
+          </w:rPr>
+          <w:t>3</w:t>
+        </w:r>
+      </w:ins>
+      <w:del w:id="61" w:author="Angel David Ramirez Romero" w:date="2026-06-10T13:54:00Z" w16du:dateUtc="2026-06-10T17:54:00Z">
+        <w:r>
+          <w:rPr>
+            <w:lang w:val="en-US"/>
+          </w:rPr>
+          <w:delText>2.5</w:delText>
+        </w:r>
+      </w:del>
+      <w:r>
+        <w:rPr>
+          <w:lang w:val="en-US"/>
+        </w:rPr>
+        <w:t>%)</w:t>
+      </w:r>
+      <w:r>
+        <w:rPr>
+          <w:lang w:val="en-US"/>
+        </w:rPr>
+        <w:t> tend to rely on a non-professional advisor (e.g. a friend or relative without a legal background, or an unknown person), raising the risk of receiving ineffective or</w:t>
       </w:r>
       <w:r>
         <w:rPr>
@@ -3637,14 +4599,76 @@
         <w:rPr>
           <w:lang w:val="en-US"/>
         </w:rPr>
-        <w:t>obtain it due to various barriers (</w:t>
-      </w:r>
-      <w:r>
-        <w:rPr>
-          <w:lang w:val="en-US"/>
-        </w:rPr>
-        <w:t>20</w:t>
-      </w:r>
+        <w:t>inaccurate information.</w:t>
+      </w:r>
+      <w:r>
+        <w:rPr>
+          <w:lang w:val="en-US"/>
+        </w:rPr>
+        <w:t xml:space="preserve"> </w:t>
+      </w:r>
+      <w:r>
+        <w:rPr>
+          <w:lang w:val="en-US"/>
+        </w:rPr>
+        <w:t>Combining these pathways, more than half of people in Malta who faced a </w:t>
+      </w:r>
+      <w:r>
+        <w:rPr>
+          <w:lang w:val="en-US"/>
+        </w:rPr>
+        <w:t>serious</w:t>
+      </w:r>
+      <w:r>
+        <w:rPr>
+          <w:lang w:val="en-US"/>
+        </w:rPr>
+        <w:t> justice problem eventually receive proper assistance and representation (</w:t>
+      </w:r>
+      <w:ins w:id="62" w:author="Angel David Ramirez Romero" w:date="2026-06-10T13:54:00Z" w16du:dateUtc="2026-06-10T17:54:00Z">
+        <w:r>
+          <w:rPr>
+            <w:lang w:val="en-US"/>
+          </w:rPr>
+          <w:t>53</w:t>
+        </w:r>
+      </w:ins>
+      <w:del w:id="63" w:author="Angel David Ramirez Romero" w:date="2026-06-10T13:54:00Z" w16du:dateUtc="2026-06-10T17:54:00Z">
+        <w:r>
+          <w:rPr>
+            <w:lang w:val="en-US"/>
+          </w:rPr>
+          <w:delText>67</w:delText>
+        </w:r>
+      </w:del>
+      <w:r>
+        <w:rPr>
+          <w:lang w:val="en-US"/>
+        </w:rPr>
+        <w:t>%). While there remains significant room for improvement, this figure exceeds the EU average</w:t>
+      </w:r>
+      <w:r>
+        <w:rPr>
+          <w:lang w:val="en-US"/>
+        </w:rPr>
+        <w:t> (</w:t>
+      </w:r>
+      <w:ins w:id="64" w:author="Angel David Ramirez Romero" w:date="2026-06-10T13:55:00Z" w16du:dateUtc="2026-06-10T17:55:00Z">
+        <w:r>
+          <w:rPr>
+            <w:lang w:val="en-US"/>
+          </w:rPr>
+          <w:t>38</w:t>
+        </w:r>
+      </w:ins>
+      <w:del w:id="65" w:author="Angel David Ramirez Romero" w:date="2026-06-10T13:55:00Z" w16du:dateUtc="2026-06-10T17:55:00Z">
+        <w:r>
+          <w:rPr>
+            <w:lang w:val="en-US"/>
+          </w:rPr>
+          <w:delText>54</w:delText>
+        </w:r>
+      </w:del>
       <w:r>
         <w:rPr>
           <w:lang w:val="en-US"/>
@@ -3655,172 +4679,42 @@
         <w:rPr>
           <w:lang w:val="en-US"/>
         </w:rPr>
-        <w:t>.</w:t>
-      </w:r>
-      <w:r>
-        <w:rPr>
-          <w:lang w:val="en-US"/>
-        </w:rPr>
-        <w:t xml:space="preserve"> </w:t>
-      </w:r>
-      <w:r>
-        <w:rPr>
-          <w:lang w:val="en-US"/>
-        </w:rPr>
-        <w:t>A</w:t>
-      </w:r>
-      <w:r>
-        <w:rPr>
-          <w:lang w:val="en-US"/>
-        </w:rPr>
-        <w:t>mong those who do seek advice, most consult an appropriate advisor </w:t>
-      </w:r>
-      <w:r>
-        <w:rPr>
-          <w:lang w:val="en-US"/>
-        </w:rPr>
-        <w:t>(37</w:t>
-      </w:r>
-      <w:r>
-        <w:rPr>
-          <w:lang w:val="en-US"/>
-        </w:rPr>
-        <w:t>.5</w:t>
-      </w:r>
-      <w:r>
-        <w:rPr>
-          <w:lang w:val="en-US"/>
-        </w:rPr>
-        <w:t xml:space="preserve">%), including a lawyer, a professional advisor, an advice service, a government legal aid office, a court or government body, the police, a </w:t>
-      </w:r>
-      <w:r>
-        <w:rPr>
-          <w:lang w:val="en-US"/>
-        </w:rPr>
-        <w:t>health or welfare professional, a trade union or employer, a civil society organisation, a religious or community leader, or a friend or relative with a legal background</w:t>
-      </w:r>
-      <w:r>
-        <w:rPr>
-          <w:lang w:val="en-US"/>
-        </w:rPr>
-        <w:t>.</w:t>
-      </w:r>
-      <w:r>
-        <w:rPr>
-          <w:rStyle w:val="FootnoteReference"/>
-          <w:lang w:val="en-US"/>
-        </w:rPr>
-        <w:footnoteReference w:id="5"/>
-      </w:r>
-      <w:r>
-        <w:rPr>
-          <w:lang w:val="en-US"/>
-        </w:rPr>
-        <w:t> </w:t>
-      </w:r>
-      <w:r>
-        <w:rPr>
-          <w:lang w:val="en-US"/>
-        </w:rPr>
-        <w:t>However</w:t>
-      </w:r>
-      <w:r>
-        <w:rPr>
-          <w:lang w:val="en-US"/>
-        </w:rPr>
-        <w:t>, the remaining </w:t>
-      </w:r>
-      <w:r>
-        <w:rPr>
-          <w:lang w:val="en-US"/>
-        </w:rPr>
-        <w:t>respondents</w:t>
-      </w:r>
-      <w:r>
-        <w:rPr>
-          <w:lang w:val="en-US"/>
-        </w:rPr>
-        <w:t xml:space="preserve"> </w:t>
-      </w:r>
-      <w:r>
-        <w:rPr>
-          <w:lang w:val="en-US"/>
-        </w:rPr>
-        <w:t>(1</w:t>
-      </w:r>
-      <w:r>
-        <w:rPr>
-          <w:lang w:val="en-US"/>
-        </w:rPr>
-        <w:t>2.5</w:t>
-      </w:r>
-      <w:r>
-        <w:rPr>
-          <w:lang w:val="en-US"/>
-        </w:rPr>
-        <w:t>%)</w:t>
-      </w:r>
-      <w:r>
-        <w:rPr>
-          <w:lang w:val="en-US"/>
-        </w:rPr>
-        <w:t> tend to rely on a non-professional advisor (e.g. a friend or relative without a legal background, or an unknown person), raising the risk of receiving ineffective or</w:t>
-      </w:r>
-      <w:r>
-        <w:rPr>
-          <w:lang w:val="en-US"/>
-        </w:rPr>
-        <w:t xml:space="preserve"> </w:t>
-      </w:r>
-      <w:r>
-        <w:rPr>
-          <w:lang w:val="en-US"/>
-        </w:rPr>
-        <w:t>inaccurate information.</w:t>
-      </w:r>
-      <w:r>
-        <w:rPr>
-          <w:lang w:val="en-US"/>
-        </w:rPr>
-        <w:t xml:space="preserve"> </w:t>
-      </w:r>
-      <w:r>
-        <w:rPr>
-          <w:lang w:val="en-US"/>
-        </w:rPr>
-        <w:t>Combining these pathways, more than half of people in Malta who faced a </w:t>
-      </w:r>
-      <w:r>
-        <w:rPr>
-          <w:lang w:val="en-US"/>
-        </w:rPr>
-        <w:t>serious</w:t>
-      </w:r>
-      <w:r>
-        <w:rPr>
-          <w:lang w:val="en-US"/>
-        </w:rPr>
-        <w:t> justice problem eventually receive proper assistance and representation (67%). While there remains significant room for improvement, this figure exceeds the EU average</w:t>
-      </w:r>
-      <w:r>
-        <w:rPr>
-          <w:lang w:val="en-US"/>
-        </w:rPr>
-        <w:t> (54%)</w:t>
-      </w:r>
-      <w:r>
-        <w:rPr>
-          <w:lang w:val="en-US"/>
-        </w:rPr>
-        <w:t>, placing Malta as the 2</w:t>
-      </w:r>
-      <w:r>
-        <w:rPr>
-          <w:vertAlign w:val="superscript"/>
-          <w:lang w:val="en-US"/>
-        </w:rPr>
-        <w:t>nd</w:t>
-      </w:r>
+        <w:t xml:space="preserve">, placing Malta as the </w:t>
+      </w:r>
+      <w:ins w:id="66" w:author="Santiago Pardo" w:date="2026-06-10T18:57:00Z" w16du:dateUtc="2026-06-10T23:57:00Z">
+        <w:r>
+          <w:rPr>
+            <w:lang w:val="en-US"/>
+          </w:rPr>
+          <w:t>1</w:t>
+        </w:r>
+      </w:ins>
+      <w:del w:id="67" w:author="Santiago Pardo" w:date="2026-06-10T18:57:00Z" w16du:dateUtc="2026-06-10T23:57:00Z">
+        <w:r>
+          <w:rPr>
+            <w:lang w:val="en-US"/>
+          </w:rPr>
+          <w:delText>2</w:delText>
+        </w:r>
+      </w:del>
+      <w:ins w:id="68" w:author="Santiago Pardo" w:date="2026-06-10T18:58:00Z" w16du:dateUtc="2026-06-10T23:58:00Z">
+        <w:r>
+          <w:rPr>
+            <w:vertAlign w:val="superscript"/>
+            <w:lang w:val="en-US"/>
+          </w:rPr>
+          <w:t>st</w:t>
+        </w:r>
+      </w:ins>
+      <w:del w:id="69" w:author="Santiago Pardo" w:date="2026-06-10T18:58:00Z" w16du:dateUtc="2026-06-10T23:58:00Z">
+        <w:r>
+          <w:rPr>
+            <w:vertAlign w:val="superscript"/>
+            <w:lang w:val="en-US"/>
+          </w:rPr>
+          <w:delText>nd</w:delText>
+        </w:r>
+      </w:del>
       <w:r>
         <w:rPr>
           <w:lang w:val="en-US"/>
@@ -3950,30 +4844,56 @@
         </w:rPr>
         <w:t xml:space="preserve"> with financial hardship struggle more to obtain appropriate legal help than those without financial constraints (</w:t>
       </w:r>
-      <w:r>
-        <w:rPr>
-          <w:lang w:val="en-US"/>
-        </w:rPr>
-        <w:t>6</w:t>
-      </w:r>
-      <w:r>
-        <w:rPr>
-          <w:lang w:val="en-US"/>
-        </w:rPr>
-        <w:t>1</w:t>
-      </w:r>
-      <w:r>
-        <w:rPr>
-          <w:lang w:val="en-US"/>
-        </w:rPr>
-        <w:t>% compared to 6</w:t>
-      </w:r>
-      <w:r>
-        <w:rPr>
-          <w:lang w:val="en-US"/>
-        </w:rPr>
-        <w:t>9</w:t>
-      </w:r>
+      <w:ins w:id="70" w:author="Angel David Ramirez Romero" w:date="2026-06-10T13:55:00Z" w16du:dateUtc="2026-06-10T17:55:00Z">
+        <w:r>
+          <w:rPr>
+            <w:lang w:val="en-US"/>
+          </w:rPr>
+          <w:t>43</w:t>
+        </w:r>
+      </w:ins>
+      <w:del w:id="71" w:author="Angel David Ramirez Romero" w:date="2026-06-10T13:55:00Z" w16du:dateUtc="2026-06-10T17:55:00Z">
+        <w:r>
+          <w:rPr>
+            <w:lang w:val="en-US"/>
+          </w:rPr>
+          <w:delText>6</w:delText>
+        </w:r>
+        <w:r>
+          <w:rPr>
+            <w:lang w:val="en-US"/>
+          </w:rPr>
+          <w:delText>1</w:delText>
+        </w:r>
+      </w:del>
+      <w:r>
+        <w:rPr>
+          <w:lang w:val="en-US"/>
+        </w:rPr>
+        <w:t xml:space="preserve">% compared to </w:t>
+      </w:r>
+      <w:ins w:id="72" w:author="Angel David Ramirez Romero" w:date="2026-06-10T13:55:00Z" w16du:dateUtc="2026-06-10T17:55:00Z">
+        <w:r>
+          <w:rPr>
+            <w:lang w:val="en-US"/>
+          </w:rPr>
+          <w:t>55</w:t>
+        </w:r>
+      </w:ins>
+      <w:del w:id="73" w:author="Angel David Ramirez Romero" w:date="2026-06-10T13:55:00Z" w16du:dateUtc="2026-06-10T17:55:00Z">
+        <w:r>
+          <w:rPr>
+            <w:lang w:val="en-US"/>
+          </w:rPr>
+          <w:delText>6</w:delText>
+        </w:r>
+        <w:r>
+          <w:rPr>
+            <w:lang w:val="en-US"/>
+          </w:rPr>
+          <w:delText>9</w:delText>
+        </w:r>
+      </w:del>
       <w:r>
         <w:rPr>
           <w:lang w:val="en-US"/>
@@ -4014,7 +4934,51 @@
         <w:rPr>
           <w:lang w:val="en-US"/>
         </w:rPr>
-        <w:t>more (70% compared to 65%)</w:t>
+        <w:t>more (</w:t>
+      </w:r>
+      <w:ins w:id="74" w:author="Angel David Ramirez Romero" w:date="2026-06-10T13:56:00Z" w16du:dateUtc="2026-06-10T17:56:00Z">
+        <w:r>
+          <w:rPr>
+            <w:lang w:val="en-US"/>
+          </w:rPr>
+          <w:t>58</w:t>
+        </w:r>
+      </w:ins>
+      <w:del w:id="75" w:author="Angel David Ramirez Romero" w:date="2026-06-10T13:56:00Z" w16du:dateUtc="2026-06-10T17:56:00Z">
+        <w:r>
+          <w:rPr>
+            <w:lang w:val="en-US"/>
+          </w:rPr>
+          <w:delText>70</w:delText>
+        </w:r>
+      </w:del>
+      <w:r>
+        <w:rPr>
+          <w:lang w:val="en-US"/>
+        </w:rPr>
+        <w:t xml:space="preserve">% compared to </w:t>
+      </w:r>
+      <w:ins w:id="76" w:author="Angel David Ramirez Romero" w:date="2026-06-10T13:56:00Z" w16du:dateUtc="2026-06-10T17:56:00Z">
+        <w:r>
+          <w:rPr>
+            <w:lang w:val="en-US"/>
+          </w:rPr>
+          <w:t>48</w:t>
+        </w:r>
+      </w:ins>
+      <w:del w:id="77" w:author="Angel David Ramirez Romero" w:date="2026-06-10T13:56:00Z" w16du:dateUtc="2026-06-10T17:56:00Z">
+        <w:r>
+          <w:rPr>
+            <w:lang w:val="en-US"/>
+          </w:rPr>
+          <w:delText>65</w:delText>
+        </w:r>
+      </w:del>
+      <w:r>
+        <w:rPr>
+          <w:lang w:val="en-US"/>
+        </w:rPr>
+        <w:t>%)</w:t>
       </w:r>
       <w:r>
         <w:rPr>
@@ -4044,8 +5008,46 @@
         <w:rPr>
           <w:lang w:val="en-US"/>
         </w:rPr>
-        <w:t>higher degree of access to appropriate assistance than those facing only one justice problem (78% compared to 5</w:t>
-      </w:r>
+        <w:t>higher degree of access to appropriate assistance than those facing only one justice problem (</w:t>
+      </w:r>
+      <w:ins w:id="78" w:author="Angel David Ramirez Romero" w:date="2026-06-10T13:56:00Z" w16du:dateUtc="2026-06-10T17:56:00Z">
+        <w:r>
+          <w:rPr>
+            <w:lang w:val="en-US"/>
+          </w:rPr>
+          <w:t>6</w:t>
+        </w:r>
+      </w:ins>
+      <w:del w:id="79" w:author="Angel David Ramirez Romero" w:date="2026-06-10T13:56:00Z" w16du:dateUtc="2026-06-10T17:56:00Z">
+        <w:r>
+          <w:rPr>
+            <w:lang w:val="en-US"/>
+          </w:rPr>
+          <w:delText>7</w:delText>
+        </w:r>
+      </w:del>
+      <w:r>
+        <w:rPr>
+          <w:lang w:val="en-US"/>
+        </w:rPr>
+        <w:t xml:space="preserve">8% compared to </w:t>
+      </w:r>
+      <w:ins w:id="80" w:author="Angel David Ramirez Romero" w:date="2026-06-10T13:56:00Z" w16du:dateUtc="2026-06-10T17:56:00Z">
+        <w:r>
+          <w:rPr>
+            <w:lang w:val="en-US"/>
+          </w:rPr>
+          <w:t>3</w:t>
+        </w:r>
+      </w:ins>
+      <w:del w:id="81" w:author="Angel David Ramirez Romero" w:date="2026-06-10T13:56:00Z" w16du:dateUtc="2026-06-10T17:56:00Z">
+        <w:r>
+          <w:rPr>
+            <w:lang w:val="en-US"/>
+          </w:rPr>
+          <w:delText>5</w:delText>
+        </w:r>
+      </w:del>
       <w:r>
         <w:rPr>
           <w:lang w:val="en-US"/>
@@ -4269,7 +5271,29 @@
         <w:rPr>
           <w:lang w:val="en-US"/>
         </w:rPr>
-        <w:t xml:space="preserve"> all the help they want, compared to 64% of those aged 18-24</w:t>
+        <w:t xml:space="preserve"> all the help they want, compared to 6</w:t>
+      </w:r>
+      <w:ins w:id="82" w:author="Angel David Ramirez Romero" w:date="2026-06-10T13:56:00Z" w16du:dateUtc="2026-06-10T17:56:00Z">
+        <w:r>
+          <w:rPr>
+            <w:lang w:val="en-US"/>
+          </w:rPr>
+          <w:t>2</w:t>
+        </w:r>
+      </w:ins>
+      <w:del w:id="83" w:author="Angel David Ramirez Romero" w:date="2026-06-10T13:56:00Z" w16du:dateUtc="2026-06-10T17:56:00Z">
+        <w:r>
+          <w:rPr>
+            <w:lang w:val="en-US"/>
+          </w:rPr>
+          <w:delText>4</w:delText>
+        </w:r>
+      </w:del>
+      <w:r>
+        <w:rPr>
+          <w:lang w:val="en-US"/>
+        </w:rPr>
+        <w:t>% of those aged 18-24</w:t>
       </w:r>
       <w:r>
         <w:rPr>
@@ -4460,30 +5484,76 @@
         </w:rPr>
         <w:t> </w:t>
       </w:r>
-      <w:r>
-        <w:rPr>
-          <w:lang w:val="en-US"/>
-        </w:rPr>
-        <w:t>While almost</w:t>
-      </w:r>
-      <w:r>
-        <w:rPr>
-          <w:lang w:val="en-US"/>
-        </w:rPr>
-        <w:t xml:space="preserve"> </w:t>
-      </w:r>
-      <w:r>
-        <w:rPr>
-          <w:lang w:val="en-US"/>
-        </w:rPr>
-        <w:t>half of people seeking assistance (4</w:t>
-      </w:r>
-      <w:r>
-        <w:rPr>
-          <w:lang w:val="en-US"/>
-        </w:rPr>
-        <w:t>7</w:t>
-      </w:r>
+      <w:del w:id="84" w:author="Santiago Pardo" w:date="2026-06-10T18:59:00Z" w16du:dateUtc="2026-06-10T23:59:00Z">
+        <w:r>
+          <w:rPr>
+            <w:lang w:val="en-US"/>
+          </w:rPr>
+          <w:delText>While almost</w:delText>
+        </w:r>
+        <w:r>
+          <w:rPr>
+            <w:lang w:val="en-US"/>
+          </w:rPr>
+          <w:delText xml:space="preserve"> </w:delText>
+        </w:r>
+        <w:r>
+          <w:rPr>
+            <w:lang w:val="en-US"/>
+          </w:rPr>
+          <w:delText>half of people </w:delText>
+        </w:r>
+      </w:del>
+      <w:ins w:id="85" w:author="Santiago Pardo" w:date="2026-06-10T18:59:00Z" w16du:dateUtc="2026-06-10T23:59:00Z">
+        <w:r>
+          <w:rPr>
+            <w:lang w:val="en-US"/>
+          </w:rPr>
+          <w:t xml:space="preserve">About four in </w:t>
+        </w:r>
+        <w:r>
+          <w:rPr>
+            <w:lang w:val="en-US"/>
+          </w:rPr>
+          <w:t xml:space="preserve">five people seeking assistance </w:t>
+        </w:r>
+      </w:ins>
+      <w:del w:id="86" w:author="Santiago Pardo" w:date="2026-06-10T18:59:00Z" w16du:dateUtc="2026-06-10T23:59:00Z">
+        <w:r>
+          <w:rPr>
+            <w:lang w:val="en-US"/>
+          </w:rPr>
+          <w:delText>seeking assistance </w:delText>
+        </w:r>
+      </w:del>
+      <w:r>
+        <w:rPr>
+          <w:lang w:val="en-US"/>
+        </w:rPr>
+        <w:t>(</w:t>
+      </w:r>
+      <w:ins w:id="87" w:author="Angel David Ramirez Romero" w:date="2026-06-10T13:57:00Z" w16du:dateUtc="2026-06-10T17:57:00Z">
+        <w:r>
+          <w:rPr>
+            <w:lang w:val="en-US"/>
+          </w:rPr>
+          <w:t>79</w:t>
+        </w:r>
+      </w:ins>
+      <w:del w:id="88" w:author="Angel David Ramirez Romero" w:date="2026-06-10T13:57:00Z" w16du:dateUtc="2026-06-10T17:57:00Z">
+        <w:r>
+          <w:rPr>
+            <w:lang w:val="en-US"/>
+          </w:rPr>
+          <w:delText>4</w:delText>
+        </w:r>
+        <w:r>
+          <w:rPr>
+            <w:lang w:val="en-US"/>
+          </w:rPr>
+          <w:delText>7</w:delText>
+        </w:r>
+      </w:del>
       <w:r>
         <w:rPr>
           <w:lang w:val="en-US"/>
@@ -4611,7 +5681,14 @@
         <w:rPr>
           <w:lang w:val="en-US"/>
         </w:rPr>
-        <w:t>, reluctance to seek help due to previous experiences, fear, distance, not knowing who to contact, or not reali</w:t>
+        <w:t xml:space="preserve">, reluctance to seek help due to previous experiences, fear, distance, not knowing who to contact, or not </w:t>
+      </w:r>
+      <w:proofErr w:type="spellStart"/>
+      <w:r>
+        <w:rPr>
+          <w:lang w:val="en-US"/>
+        </w:rPr>
+        <w:t>reali</w:t>
       </w:r>
       <w:r>
         <w:rPr>
@@ -4623,7 +5700,14 @@
         <w:rPr>
           <w:lang w:val="en-US"/>
         </w:rPr>
-        <w:t>ing that advice was available.</w:t>
+        <w:t>ing</w:t>
+      </w:r>
+      <w:proofErr w:type="spellEnd"/>
+      <w:r>
+        <w:rPr>
+          <w:lang w:val="en-US"/>
+        </w:rPr>
+        <w:t xml:space="preserve"> that advice was available.</w:t>
       </w:r>
       <w:r>
         <w:rPr>
@@ -4642,7 +5726,29 @@
         <w:rPr>
           <w:lang w:val="en-US"/>
         </w:rPr>
-        <w:t xml:space="preserve">In addition to these practical obstacles, many people perceive legal assistance as largely inaccessible : while 67% of people are actually able to access appropriate assistance, only 43% of the general population believe that people in Malta have access to affordable legal help if they need it </w:t>
+        <w:t xml:space="preserve">In addition to these practical obstacles, many people perceive legal assistance as largely inaccessible : while </w:t>
+      </w:r>
+      <w:ins w:id="89" w:author="Angel David Ramirez Romero" w:date="2026-06-10T13:58:00Z" w16du:dateUtc="2026-06-10T17:58:00Z">
+        <w:r>
+          <w:rPr>
+            <w:lang w:val="en-US"/>
+          </w:rPr>
+          <w:t>53</w:t>
+        </w:r>
+      </w:ins>
+      <w:del w:id="90" w:author="Angel David Ramirez Romero" w:date="2026-06-10T13:58:00Z" w16du:dateUtc="2026-06-10T17:58:00Z">
+        <w:r>
+          <w:rPr>
+            <w:lang w:val="en-US"/>
+          </w:rPr>
+          <w:delText>67</w:delText>
+        </w:r>
+      </w:del>
+      <w:r>
+        <w:rPr>
+          <w:lang w:val="en-US"/>
+        </w:rPr>
+        <w:t xml:space="preserve">% of people are actually able to access appropriate assistance, only 43% of the general population believe that people in Malta have access to affordable legal help if they need it </w:t>
       </w:r>
       <w:sdt>
         <w:sdtPr>
@@ -4700,7 +5806,21 @@
         <w:rPr>
           <w:lang w:val="en-US"/>
         </w:rPr>
-        <w:t xml:space="preserve">cannot be directly compared with individual experiences reported in the survey, the justice system appears to be perceived as inaccessible and unaffordable even when the majority of people ultimately </w:t>
+        <w:t>cannot be directly compared with individual experiences reported in the survey, the justice system appears to be perceived as inaccessible and unaffordable even when </w:t>
+      </w:r>
+      <w:proofErr w:type="gramStart"/>
+      <w:r>
+        <w:rPr>
+          <w:lang w:val="en-US"/>
+        </w:rPr>
+        <w:t>the majority of</w:t>
+      </w:r>
+      <w:proofErr w:type="gramEnd"/>
+      <w:r>
+        <w:rPr>
+          <w:lang w:val="en-US"/>
+        </w:rPr>
+        <w:t xml:space="preserve"> people ultimately </w:t>
       </w:r>
       <w:r>
         <w:rPr>
@@ -4736,11 +5856,12 @@
       <w:pPr>
         <w:pStyle w:val="Caption"/>
       </w:pPr>
-      <w:bookmarkStart w:id="13" w:name="_Toc228959130"/>
-      <w:r>
-        <w:rPr>
-          <w:lang w:val="en-US"/>
-        </w:rPr>
+      <w:bookmarkStart w:id="91" w:name="_Toc228959130"/>
+      <w:r>
+        <w:rPr>
+          <w:lang w:val="en-US"/>
+        </w:rPr>
+        <w:lastRenderedPageBreak/>
         <w:t>Figure </w:t>
       </w:r>
       <w:r>
@@ -4815,7 +5936,7 @@
         </w:rPr>
         <w:t>. Pathways to accessing appropriate assistance and representation in Malta</w:t>
       </w:r>
-      <w:bookmarkEnd w:id="13"/>
+      <w:bookmarkEnd w:id="91"/>
     </w:p>
     <w:p>
       <w:pPr>
@@ -4825,45 +5946,95 @@
           <w:lang w:val="en-GB"/>
         </w:rPr>
       </w:pPr>
-      <w:r>
-        <w:rPr>
-          <w:noProof/>
-          <w:lang w:val="en-GB"/>
-        </w:rPr>
-        <w:drawing>
-          <wp:inline distT="0" distB="0" distL="0" distR="0" wp14:anchorId="3E26C20D" wp14:editId="3403657A">
-            <wp:extent cx="6288619" cy="4196770"/>
-            <wp:effectExtent l="0" t="0" r="0" b="0"/>
-            <wp:docPr id="516408319" name="Picture 10"/>
-            <wp:cNvGraphicFramePr/>
-            <a:graphic xmlns:a="http://schemas.openxmlformats.org/drawingml/2006/main">
-              <a:graphicData uri="http://schemas.openxmlformats.org/drawingml/2006/picture">
-                <pic:pic xmlns:pic="http://schemas.openxmlformats.org/drawingml/2006/picture">
-                  <pic:nvPicPr>
-                    <pic:cNvPr id="516408319" name="Picture 10"/>
-                    <pic:cNvPicPr/>
-                  </pic:nvPicPr>
-                  <pic:blipFill>
-                    <a:blip r:embed="rId16"/>
-                    <a:stretch>
-                      <a:fillRect/>
-                    </a:stretch>
-                  </pic:blipFill>
-                  <pic:spPr>
-                    <a:xfrm>
-                      <a:off x="0" y="0"/>
-                      <a:ext cx="6288619" cy="4196770"/>
-                    </a:xfrm>
-                    <a:prstGeom prst="rect">
-                      <a:avLst/>
-                    </a:prstGeom>
-                  </pic:spPr>
-                </pic:pic>
-              </a:graphicData>
-            </a:graphic>
-          </wp:inline>
-        </w:drawing>
-      </w:r>
+      <w:del w:id="92" w:author="Angel David Ramirez Romero" w:date="2026-06-10T14:21:00Z" w16du:dateUtc="2026-06-10T18:21:00Z">
+        <w:r>
+          <w:rPr>
+            <w:noProof/>
+            <w:lang w:val="en-GB"/>
+          </w:rPr>
+          <w:drawing>
+            <wp:inline distT="0" distB="0" distL="0" distR="0" wp14:anchorId="3E26C20D" wp14:editId="5DFC7908">
+              <wp:extent cx="6288619" cy="4196770"/>
+              <wp:effectExtent l="0" t="0" r="0" b="0"/>
+              <wp:docPr id="516408319" name="Picture 10"/>
+              <wp:cNvGraphicFramePr/>
+              <a:graphic xmlns:a="http://schemas.openxmlformats.org/drawingml/2006/main">
+                <a:graphicData uri="http://schemas.openxmlformats.org/drawingml/2006/picture">
+                  <pic:pic xmlns:pic="http://schemas.openxmlformats.org/drawingml/2006/picture">
+                    <pic:nvPicPr>
+                      <pic:cNvPr id="516408319" name="Picture 10"/>
+                      <pic:cNvPicPr/>
+                    </pic:nvPicPr>
+                    <pic:blipFill>
+                      <a:blip r:embed="rId23"/>
+                      <a:stretch>
+                        <a:fillRect/>
+                      </a:stretch>
+                    </pic:blipFill>
+                    <pic:spPr>
+                      <a:xfrm>
+                        <a:off x="0" y="0"/>
+                        <a:ext cx="6288619" cy="4196770"/>
+                      </a:xfrm>
+                      <a:prstGeom prst="rect">
+                        <a:avLst/>
+                      </a:prstGeom>
+                    </pic:spPr>
+                  </pic:pic>
+                </a:graphicData>
+              </a:graphic>
+            </wp:inline>
+          </w:drawing>
+        </w:r>
+      </w:del>
+      <w:ins w:id="93" w:author="Angel David Ramirez Romero" w:date="2026-06-10T14:21:00Z" w16du:dateUtc="2026-06-10T18:21:00Z">
+        <w:r>
+          <w:rPr>
+            <w:noProof/>
+          </w:rPr>
+          <w:drawing>
+            <wp:inline distT="0" distB="0" distL="0" distR="0" wp14:anchorId="6F9D325D" wp14:editId="7CA21F3B">
+              <wp:extent cx="3812540" cy="2765685"/>
+              <wp:effectExtent l="0" t="0" r="0" b="3175"/>
+              <wp:docPr id="49823301" name="Picture 4"/>
+              <wp:cNvGraphicFramePr>
+                <a:graphicFrameLocks xmlns:a="http://schemas.openxmlformats.org/drawingml/2006/main" noChangeAspect="1"/>
+              </wp:cNvGraphicFramePr>
+              <a:graphic xmlns:a="http://schemas.openxmlformats.org/drawingml/2006/main">
+                <a:graphicData uri="http://schemas.openxmlformats.org/drawingml/2006/picture">
+                  <pic:pic xmlns:pic="http://schemas.openxmlformats.org/drawingml/2006/picture">
+                    <pic:nvPicPr>
+                      <pic:cNvPr id="49823301" name="Picture 49823301"/>
+                      <pic:cNvPicPr/>
+                    </pic:nvPicPr>
+                    <pic:blipFill>
+                      <a:blip r:embed="rId24" cstate="print">
+                        <a:extLst>
+                          <a:ext uri="{28A0092B-C50C-407E-A947-70E740481C1C}">
+                            <a14:useLocalDpi xmlns:a14="http://schemas.microsoft.com/office/drawing/2010/main" val="0"/>
+                          </a:ext>
+                        </a:extLst>
+                      </a:blip>
+                      <a:stretch>
+                        <a:fillRect/>
+                      </a:stretch>
+                    </pic:blipFill>
+                    <pic:spPr>
+                      <a:xfrm>
+                        <a:off x="0" y="0"/>
+                        <a:ext cx="3871222" cy="2808254"/>
+                      </a:xfrm>
+                      <a:prstGeom prst="rect">
+                        <a:avLst/>
+                      </a:prstGeom>
+                    </pic:spPr>
+                  </pic:pic>
+                </a:graphicData>
+              </a:graphic>
+            </wp:inline>
+          </w:drawing>
+        </w:r>
+      </w:ins>
     </w:p>
     <w:p>
       <w:pPr>
@@ -4954,7 +6125,6 @@
         <w:rPr>
           <w:lang w:val="en-US"/>
         </w:rPr>
-        <w:lastRenderedPageBreak/>
         <w:t xml:space="preserve">In Malta, a relatively small share of people who experienced a </w:t>
       </w:r>
       <w:r>
@@ -4979,13 +6149,49 @@
         <w:rPr>
           <w:lang w:val="en-US"/>
         </w:rPr>
-        <w:t xml:space="preserve">a third-party individual or organisation to intervene, mediate, or adjudicate (20%). </w:t>
-      </w:r>
-      <w:r>
-        <w:rPr>
-          <w:lang w:val="en-US"/>
-        </w:rPr>
-        <w:t>The police is the most frequently approached dispute resolution mechanism (5</w:t>
+        <w:t xml:space="preserve">a third-party individual or </w:t>
+      </w:r>
+      <w:del w:id="94" w:author="Angel David Ramirez Romero" w:date="2026-06-10T13:59:00Z" w16du:dateUtc="2026-06-10T17:59:00Z">
+        <w:r>
+          <w:rPr>
+            <w:lang w:val="en-US"/>
+          </w:rPr>
+          <w:delText>organisation</w:delText>
+        </w:r>
+      </w:del>
+      <w:ins w:id="95" w:author="Angel David Ramirez Romero" w:date="2026-06-10T13:59:00Z" w16du:dateUtc="2026-06-10T17:59:00Z">
+        <w:r>
+          <w:rPr>
+            <w:lang w:val="en-US"/>
+          </w:rPr>
+          <w:t>organization</w:t>
+        </w:r>
+      </w:ins>
+      <w:r>
+        <w:rPr>
+          <w:lang w:val="en-US"/>
+        </w:rPr>
+        <w:t xml:space="preserve"> to intervene, mediate, or adjudicate (20%). </w:t>
+      </w:r>
+      <w:r>
+        <w:rPr>
+          <w:lang w:val="en-US"/>
+        </w:rPr>
+        <w:t xml:space="preserve">The police </w:t>
+      </w:r>
+      <w:proofErr w:type="gramStart"/>
+      <w:r>
+        <w:rPr>
+          <w:lang w:val="en-US"/>
+        </w:rPr>
+        <w:t>is</w:t>
+      </w:r>
+      <w:proofErr w:type="gramEnd"/>
+      <w:r>
+        <w:rPr>
+          <w:lang w:val="en-US"/>
+        </w:rPr>
+        <w:t xml:space="preserve"> the most frequently approached dispute resolution mechanism (5</w:t>
       </w:r>
       <w:r>
         <w:rPr>
@@ -5229,8 +6435,24 @@
         <w:rPr>
           <w:lang w:val="en-US"/>
         </w:rPr>
-        <w:t>third-party individual or an organisation</w:t>
-      </w:r>
+        <w:t xml:space="preserve">third-party individual or an </w:t>
+      </w:r>
+      <w:del w:id="96" w:author="Angel David Ramirez Romero" w:date="2026-06-10T14:02:00Z" w16du:dateUtc="2026-06-10T18:02:00Z">
+        <w:r>
+          <w:rPr>
+            <w:lang w:val="en-US"/>
+          </w:rPr>
+          <w:delText>organisation</w:delText>
+        </w:r>
+      </w:del>
+      <w:ins w:id="97" w:author="Angel David Ramirez Romero" w:date="2026-06-10T14:02:00Z" w16du:dateUtc="2026-06-10T18:02:00Z">
+        <w:r>
+          <w:rPr>
+            <w:lang w:val="en-US"/>
+          </w:rPr>
+          <w:t>organization</w:t>
+        </w:r>
+      </w:ins>
       <w:r>
         <w:rPr>
           <w:lang w:val="en-US"/>
@@ -5277,7 +6499,14 @@
         <w:rPr>
           <w:lang w:val="en-US"/>
         </w:rPr>
-        <w:t xml:space="preserve"> of available services, </w:t>
+        <w:t xml:space="preserve"> of available </w:t>
+      </w:r>
+      <w:proofErr w:type="gramStart"/>
+      <w:r>
+        <w:rPr>
+          <w:lang w:val="en-US"/>
+        </w:rPr>
+        <w:t xml:space="preserve">services, </w:t>
       </w:r>
       <w:r>
         <w:rPr>
@@ -5289,7 +6518,14 @@
         <w:rPr>
           <w:lang w:val="en-US"/>
         </w:rPr>
-        <w:t xml:space="preserve">belief that the process is too long, </w:t>
+        <w:t>belief</w:t>
+      </w:r>
+      <w:proofErr w:type="gramEnd"/>
+      <w:r>
+        <w:rPr>
+          <w:lang w:val="en-US"/>
+        </w:rPr>
+        <w:t xml:space="preserve"> that the process is too long, </w:t>
       </w:r>
       <w:r>
         <w:rPr>
@@ -5389,6 +6625,7 @@
         <w:rPr>
           <w:lang w:val="en-US"/>
         </w:rPr>
+        <w:lastRenderedPageBreak/>
         <w:t>Ultimately, among people who need a dispute resolution mechanism, only 5</w:t>
       </w:r>
       <w:r>
@@ -5584,7 +6821,7 @@
           <w:r>
             <w:t xml:space="preserve">    </w:t>
           </w:r>
-          <w:bookmarkStart w:id="14" w:name="_Toc228959131"/>
+          <w:bookmarkStart w:id="98" w:name="_Toc228959131"/>
           <w:r>
             <w:t xml:space="preserve"> </w:t>
           </w:r>
@@ -5665,7 +6902,7 @@
       <w:r>
         <w:t>Malta</w:t>
       </w:r>
-      <w:bookmarkEnd w:id="14"/>
+      <w:bookmarkEnd w:id="98"/>
       <w:r>
         <w:rPr>
           <w:b w:val="0"/>
@@ -5685,45 +6922,95 @@
           <w:lang w:val="en-GB"/>
         </w:rPr>
       </w:pPr>
-      <w:r>
-        <w:rPr>
-          <w:noProof/>
-          <w:lang w:val="en-GB"/>
-        </w:rPr>
-        <w:drawing>
-          <wp:inline distT="0" distB="0" distL="0" distR="0" wp14:anchorId="24F7B7D4" wp14:editId="6F16A47D">
-            <wp:extent cx="5224400" cy="3131180"/>
-            <wp:effectExtent l="0" t="0" r="0" b="0"/>
-            <wp:docPr id="1232422770" name="Picture 10"/>
-            <wp:cNvGraphicFramePr/>
-            <a:graphic xmlns:a="http://schemas.openxmlformats.org/drawingml/2006/main">
-              <a:graphicData uri="http://schemas.openxmlformats.org/drawingml/2006/picture">
-                <pic:pic xmlns:pic="http://schemas.openxmlformats.org/drawingml/2006/picture">
-                  <pic:nvPicPr>
-                    <pic:cNvPr id="1232422770" name="Picture 10"/>
-                    <pic:cNvPicPr/>
-                  </pic:nvPicPr>
-                  <pic:blipFill>
-                    <a:blip r:embed="rId17"/>
-                    <a:stretch>
-                      <a:fillRect/>
-                    </a:stretch>
-                  </pic:blipFill>
-                  <pic:spPr>
-                    <a:xfrm>
-                      <a:off x="0" y="0"/>
-                      <a:ext cx="5224400" cy="3131180"/>
-                    </a:xfrm>
-                    <a:prstGeom prst="rect">
-                      <a:avLst/>
-                    </a:prstGeom>
-                  </pic:spPr>
-                </pic:pic>
-              </a:graphicData>
-            </a:graphic>
-          </wp:inline>
-        </w:drawing>
-      </w:r>
+      <w:del w:id="99" w:author="Angel David Ramirez Romero" w:date="2026-06-10T14:21:00Z" w16du:dateUtc="2026-06-10T18:21:00Z">
+        <w:r>
+          <w:rPr>
+            <w:noProof/>
+            <w:lang w:val="en-GB"/>
+          </w:rPr>
+          <w:drawing>
+            <wp:inline distT="0" distB="0" distL="0" distR="0" wp14:anchorId="24F7B7D4" wp14:editId="6E1CB901">
+              <wp:extent cx="5224400" cy="3131180"/>
+              <wp:effectExtent l="0" t="0" r="0" b="0"/>
+              <wp:docPr id="1232422770" name="Picture 10"/>
+              <wp:cNvGraphicFramePr/>
+              <a:graphic xmlns:a="http://schemas.openxmlformats.org/drawingml/2006/main">
+                <a:graphicData uri="http://schemas.openxmlformats.org/drawingml/2006/picture">
+                  <pic:pic xmlns:pic="http://schemas.openxmlformats.org/drawingml/2006/picture">
+                    <pic:nvPicPr>
+                      <pic:cNvPr id="1232422770" name="Picture 10"/>
+                      <pic:cNvPicPr/>
+                    </pic:nvPicPr>
+                    <pic:blipFill>
+                      <a:blip r:embed="rId25"/>
+                      <a:stretch>
+                        <a:fillRect/>
+                      </a:stretch>
+                    </pic:blipFill>
+                    <pic:spPr>
+                      <a:xfrm>
+                        <a:off x="0" y="0"/>
+                        <a:ext cx="5224400" cy="3131180"/>
+                      </a:xfrm>
+                      <a:prstGeom prst="rect">
+                        <a:avLst/>
+                      </a:prstGeom>
+                    </pic:spPr>
+                  </pic:pic>
+                </a:graphicData>
+              </a:graphic>
+            </wp:inline>
+          </w:drawing>
+        </w:r>
+      </w:del>
+      <w:ins w:id="100" w:author="Angel David Ramirez Romero" w:date="2026-06-10T14:21:00Z" w16du:dateUtc="2026-06-10T18:21:00Z">
+        <w:r>
+          <w:rPr>
+            <w:noProof/>
+          </w:rPr>
+          <w:drawing>
+            <wp:inline distT="0" distB="0" distL="0" distR="0" wp14:anchorId="353EA634" wp14:editId="3F7AFAAC">
+              <wp:extent cx="4731385" cy="2223083"/>
+              <wp:effectExtent l="0" t="0" r="0" b="0"/>
+              <wp:docPr id="1643501993" name="Picture 19"/>
+              <wp:cNvGraphicFramePr>
+                <a:graphicFrameLocks xmlns:a="http://schemas.openxmlformats.org/drawingml/2006/main" noChangeAspect="1"/>
+              </wp:cNvGraphicFramePr>
+              <a:graphic xmlns:a="http://schemas.openxmlformats.org/drawingml/2006/main">
+                <a:graphicData uri="http://schemas.openxmlformats.org/drawingml/2006/picture">
+                  <pic:pic xmlns:pic="http://schemas.openxmlformats.org/drawingml/2006/picture">
+                    <pic:nvPicPr>
+                      <pic:cNvPr id="1643501993" name="Picture 1643501993"/>
+                      <pic:cNvPicPr/>
+                    </pic:nvPicPr>
+                    <pic:blipFill>
+                      <a:blip r:embed="rId26" cstate="print">
+                        <a:extLst>
+                          <a:ext uri="{28A0092B-C50C-407E-A947-70E740481C1C}">
+                            <a14:useLocalDpi xmlns:a14="http://schemas.microsoft.com/office/drawing/2010/main" val="0"/>
+                          </a:ext>
+                        </a:extLst>
+                      </a:blip>
+                      <a:stretch>
+                        <a:fillRect/>
+                      </a:stretch>
+                    </pic:blipFill>
+                    <pic:spPr>
+                      <a:xfrm>
+                        <a:off x="0" y="0"/>
+                        <a:ext cx="4752143" cy="2232837"/>
+                      </a:xfrm>
+                      <a:prstGeom prst="rect">
+                        <a:avLst/>
+                      </a:prstGeom>
+                    </pic:spPr>
+                  </pic:pic>
+                </a:graphicData>
+              </a:graphic>
+            </wp:inline>
+          </w:drawing>
+        </w:r>
+      </w:ins>
     </w:p>
     <w:p>
       <w:pPr>
@@ -5769,14 +7056,32 @@
           <w:color w:val="000000"/>
           <w:szCs w:val="18"/>
         </w:rPr>
-        <w:t xml:space="preserve"> rounded up to the nearest whole number</w:t>
-      </w:r>
+        <w:t xml:space="preserve"> rounded</w:t>
+      </w:r>
+      <w:del w:id="101" w:author="Santiago Pardo" w:date="2026-06-10T18:30:00Z" w16du:dateUtc="2026-06-10T23:30:00Z">
+        <w:r>
+          <w:rPr>
+            <w:rFonts w:ascii="Arial Narrow" w:eastAsia="Times New Roman" w:hAnsi="Arial Narrow" w:cs="Segoe UI"/>
+            <w:color w:val="000000"/>
+            <w:szCs w:val="18"/>
+          </w:rPr>
+          <w:delText xml:space="preserve"> up</w:delText>
+        </w:r>
+      </w:del>
       <w:r>
         <w:rPr>
           <w:rFonts w:ascii="Arial Narrow" w:eastAsia="Times New Roman" w:hAnsi="Arial Narrow" w:cs="Segoe UI"/>
           <w:color w:val="000000"/>
           <w:szCs w:val="18"/>
         </w:rPr>
+        <w:t xml:space="preserve"> to the nearest whole number</w:t>
+      </w:r>
+      <w:r>
+        <w:rPr>
+          <w:rFonts w:ascii="Arial Narrow" w:eastAsia="Times New Roman" w:hAnsi="Arial Narrow" w:cs="Segoe UI"/>
+          <w:color w:val="000000"/>
+          <w:szCs w:val="18"/>
+        </w:rPr>
         <w:t>.</w:t>
       </w:r>
     </w:p>
@@ -5785,7 +7090,6 @@
         <w:pStyle w:val="Sourcenotes"/>
       </w:pPr>
       <w:r>
-        <w:lastRenderedPageBreak/>
         <w:t>Source</w:t>
       </w:r>
       <w:r>
@@ -5918,7 +7222,29 @@
         <w:rPr>
           <w:lang w:val="en-US"/>
         </w:rPr>
-        <w:t>% finalising their cases within a year compared to 8</w:t>
+        <w:t xml:space="preserve">% </w:t>
+      </w:r>
+      <w:del w:id="102" w:author="Angel David Ramirez Romero" w:date="2026-06-10T14:08:00Z" w16du:dateUtc="2026-06-10T18:08:00Z">
+        <w:r>
+          <w:rPr>
+            <w:lang w:val="en-US"/>
+          </w:rPr>
+          <w:delText>finalising</w:delText>
+        </w:r>
+      </w:del>
+      <w:ins w:id="103" w:author="Angel David Ramirez Romero" w:date="2026-06-10T14:08:00Z" w16du:dateUtc="2026-06-10T18:08:00Z">
+        <w:r>
+          <w:rPr>
+            <w:lang w:val="en-US"/>
+          </w:rPr>
+          <w:t>finalizing</w:t>
+        </w:r>
+      </w:ins>
+      <w:r>
+        <w:rPr>
+          <w:lang w:val="en-US"/>
+        </w:rPr>
+        <w:t xml:space="preserve"> their cases within a year compared to 8</w:t>
       </w:r>
       <w:r>
         <w:rPr>
@@ -5930,7 +7256,21 @@
         <w:rPr>
           <w:lang w:val="en-US"/>
         </w:rPr>
-        <w:t xml:space="preserve">% of men. Despite the efficiency suggested by the relatively high rate of issues resolved within a year, perceptions of delay remain widespread in Malta. A majority of people describe the process as slow </w:t>
+        <w:t xml:space="preserve">% of men. Despite the efficiency suggested by the relatively high rate of issues resolved within a year, perceptions of delay remain widespread in Malta. </w:t>
+      </w:r>
+      <w:proofErr w:type="gramStart"/>
+      <w:r>
+        <w:rPr>
+          <w:lang w:val="en-US"/>
+        </w:rPr>
+        <w:t>A majority of</w:t>
+      </w:r>
+      <w:proofErr w:type="gramEnd"/>
+      <w:r>
+        <w:rPr>
+          <w:lang w:val="en-US"/>
+        </w:rPr>
+        <w:t xml:space="preserve"> people describe the process as slow </w:t>
       </w:r>
       <w:r>
         <w:rPr>
@@ -6059,7 +7399,29 @@
         <w:rPr>
           <w:lang w:val="en-US"/>
         </w:rPr>
-        <w:t>his rate is higher than the EU average of 54%, placing Malta 6</w:t>
+        <w:t>his rate is higher than the EU average of 5</w:t>
+      </w:r>
+      <w:ins w:id="104" w:author="Angel David Ramirez Romero" w:date="2026-06-10T14:09:00Z" w16du:dateUtc="2026-06-10T18:09:00Z">
+        <w:r>
+          <w:rPr>
+            <w:lang w:val="en-US"/>
+          </w:rPr>
+          <w:t>3</w:t>
+        </w:r>
+      </w:ins>
+      <w:del w:id="105" w:author="Angel David Ramirez Romero" w:date="2026-06-10T14:09:00Z" w16du:dateUtc="2026-06-10T18:09:00Z">
+        <w:r>
+          <w:rPr>
+            <w:lang w:val="en-US"/>
+          </w:rPr>
+          <w:delText>4</w:delText>
+        </w:r>
+      </w:del>
+      <w:r>
+        <w:rPr>
+          <w:lang w:val="en-US"/>
+        </w:rPr>
+        <w:t>%, placing Malta 6</w:t>
       </w:r>
       <w:r>
         <w:rPr>
@@ -6512,7 +7874,14 @@
         <w:rPr>
           <w:lang w:val="en-US"/>
         </w:rPr>
-        <w:t xml:space="preserve"> may reflect differences in income levels or access to financial resources</w:t>
+        <w:t xml:space="preserve"> </w:t>
+      </w:r>
+      <w:r>
+        <w:rPr>
+          <w:lang w:val="en-US"/>
+        </w:rPr>
+        <w:lastRenderedPageBreak/>
+        <w:t>may reflect differences in income levels or access to financial resources</w:t>
       </w:r>
       <w:r>
         <w:rPr>
@@ -6903,11 +8272,19 @@
       <w:pPr>
         <w:pStyle w:val="Para0"/>
       </w:pPr>
-      <w:r>
-        <w:rPr>
-          <w:lang w:val="en-US"/>
-        </w:rPr>
-        <w:t>A majority of people (</w:t>
+      <w:proofErr w:type="gramStart"/>
+      <w:r>
+        <w:rPr>
+          <w:lang w:val="en-US"/>
+        </w:rPr>
+        <w:t>A majority of</w:t>
+      </w:r>
+      <w:proofErr w:type="gramEnd"/>
+      <w:r>
+        <w:rPr>
+          <w:lang w:val="en-US"/>
+        </w:rPr>
+        <w:t> people (</w:t>
       </w:r>
       <w:r>
         <w:rPr>
@@ -6949,19 +8326,67 @@
         <w:rPr>
           <w:lang w:val="en-US"/>
         </w:rPr>
-        <w:t>Satisfaction is  higher among those whose outcomes were favo</w:t>
-      </w:r>
-      <w:r>
-        <w:rPr>
-          <w:lang w:val="en-US"/>
-        </w:rPr>
-        <w:t>u</w:t>
-      </w:r>
-      <w:r>
-        <w:rPr>
-          <w:lang w:val="en-US"/>
-        </w:rPr>
-        <w:t>rable (</w:t>
+        <w:t>Satisfaction </w:t>
+      </w:r>
+      <w:proofErr w:type="gramStart"/>
+      <w:r>
+        <w:rPr>
+          <w:lang w:val="en-US"/>
+        </w:rPr>
+        <w:t>is  higher</w:t>
+      </w:r>
+      <w:proofErr w:type="gramEnd"/>
+      <w:r>
+        <w:rPr>
+          <w:lang w:val="en-US"/>
+        </w:rPr>
+        <w:t xml:space="preserve"> among those whose outcomes were </w:t>
+      </w:r>
+      <w:del w:id="106" w:author="Angel David Ramirez Romero" w:date="2026-06-10T14:11:00Z" w16du:dateUtc="2026-06-10T18:11:00Z">
+        <w:r>
+          <w:rPr>
+            <w:lang w:val="en-US"/>
+          </w:rPr>
+          <w:delText>favo</w:delText>
+        </w:r>
+        <w:r>
+          <w:rPr>
+            <w:lang w:val="en-US"/>
+          </w:rPr>
+          <w:delText>u</w:delText>
+        </w:r>
+        <w:r>
+          <w:rPr>
+            <w:lang w:val="en-US"/>
+          </w:rPr>
+          <w:delText>rable</w:delText>
+        </w:r>
+      </w:del>
+      <w:ins w:id="107" w:author="Angel David Ramirez Romero" w:date="2026-06-10T14:11:00Z" w16du:dateUtc="2026-06-10T18:11:00Z">
+        <w:r>
+          <w:rPr>
+            <w:lang w:val="en-US"/>
+          </w:rPr>
+          <w:t>favo</w:t>
+        </w:r>
+        <w:r>
+          <w:rPr>
+            <w:lang w:val="en-US"/>
+          </w:rPr>
+          <w:t>r</w:t>
+        </w:r>
+        <w:r>
+          <w:rPr>
+            <w:lang w:val="en-US"/>
+          </w:rPr>
+          <w:t>able</w:t>
+        </w:r>
+      </w:ins>
+      <w:r>
+        <w:rPr>
+          <w:lang w:val="en-US"/>
+        </w:rPr>
+        <w:t> (</w:t>
       </w:r>
       <w:r>
         <w:rPr>
@@ -6985,7 +8410,29 @@
         <w:rPr>
           <w:lang w:val="en-US"/>
         </w:rPr>
-        <w:t xml:space="preserve"> and far lower among those whose issues remained unresolved or ended unfavourably (4</w:t>
+        <w:t xml:space="preserve"> and far lower among those whose issues remained unresolved or ended </w:t>
+      </w:r>
+      <w:del w:id="108" w:author="Angel David Ramirez Romero" w:date="2026-06-10T14:11:00Z" w16du:dateUtc="2026-06-10T18:11:00Z">
+        <w:r>
+          <w:rPr>
+            <w:lang w:val="en-US"/>
+          </w:rPr>
+          <w:delText>unfavourably</w:delText>
+        </w:r>
+      </w:del>
+      <w:ins w:id="109" w:author="Angel David Ramirez Romero" w:date="2026-06-10T14:11:00Z" w16du:dateUtc="2026-06-10T18:11:00Z">
+        <w:r>
+          <w:rPr>
+            <w:lang w:val="en-US"/>
+          </w:rPr>
+          <w:t>unfavorably</w:t>
+        </w:r>
+      </w:ins>
+      <w:r>
+        <w:rPr>
+          <w:lang w:val="en-US"/>
+        </w:rPr>
+        <w:t xml:space="preserve"> (4</w:t>
       </w:r>
       <w:r>
         <w:rPr>
@@ -7062,9 +8509,8 @@
       <w:pPr>
         <w:pStyle w:val="Caption"/>
       </w:pPr>
-      <w:bookmarkStart w:id="15" w:name="_Toc228959132"/>
-      <w:r>
-        <w:lastRenderedPageBreak/>
+      <w:bookmarkStart w:id="110" w:name="_Toc228959132"/>
+      <w:r>
         <w:t>Figure </w:t>
       </w:r>
       <w:r>
@@ -7139,7 +8585,7 @@
       <w:r>
         <w:t>Malta</w:t>
       </w:r>
-      <w:bookmarkEnd w:id="15"/>
+      <w:bookmarkEnd w:id="110"/>
       <w:r>
         <w:t> </w:t>
       </w:r>
@@ -7152,45 +8598,148 @@
           <w:lang w:val="en-GB"/>
         </w:rPr>
       </w:pPr>
-      <w:r>
-        <w:rPr>
-          <w:noProof/>
-          <w:lang w:val="en-GB"/>
-        </w:rPr>
-        <w:drawing>
-          <wp:inline distT="0" distB="0" distL="0" distR="0" wp14:anchorId="0CE2C5C4" wp14:editId="76A15348">
-            <wp:extent cx="6011141" cy="5115172"/>
-            <wp:effectExtent l="0" t="0" r="0" b="0"/>
-            <wp:docPr id="760464022" name="Picture 10"/>
-            <wp:cNvGraphicFramePr/>
-            <a:graphic xmlns:a="http://schemas.openxmlformats.org/drawingml/2006/main">
-              <a:graphicData uri="http://schemas.openxmlformats.org/drawingml/2006/picture">
-                <pic:pic xmlns:pic="http://schemas.openxmlformats.org/drawingml/2006/picture">
-                  <pic:nvPicPr>
-                    <pic:cNvPr id="760464022" name="Picture 10"/>
-                    <pic:cNvPicPr/>
-                  </pic:nvPicPr>
-                  <pic:blipFill>
-                    <a:blip r:embed="rId18"/>
-                    <a:stretch>
-                      <a:fillRect/>
-                    </a:stretch>
-                  </pic:blipFill>
-                  <pic:spPr>
-                    <a:xfrm>
-                      <a:off x="0" y="0"/>
-                      <a:ext cx="6011141" cy="5115172"/>
-                    </a:xfrm>
-                    <a:prstGeom prst="rect">
-                      <a:avLst/>
-                    </a:prstGeom>
-                  </pic:spPr>
-                </pic:pic>
-              </a:graphicData>
-            </a:graphic>
-          </wp:inline>
-        </w:drawing>
-      </w:r>
+      <w:ins w:id="111" w:author="Angel David Ramirez Romero [2]" w:date="2026-06-11T16:52:00Z" w16du:dateUtc="2026-06-11T20:52:00Z">
+        <w:r>
+          <w:rPr>
+            <w:noProof/>
+            <w:lang w:val="en-GB"/>
+          </w:rPr>
+          <w:drawing>
+            <wp:inline distT="0" distB="0" distL="0" distR="0" wp14:anchorId="21A5D776" wp14:editId="4E452BF5">
+              <wp:extent cx="5465380" cy="2816158"/>
+              <wp:effectExtent l="0" t="0" r="0" b="0"/>
+              <wp:docPr id="2064367550" name="Picture 7"/>
+              <wp:cNvGraphicFramePr>
+                <a:graphicFrameLocks xmlns:a="http://schemas.openxmlformats.org/drawingml/2006/main" noChangeAspect="1"/>
+              </wp:cNvGraphicFramePr>
+              <a:graphic xmlns:a="http://schemas.openxmlformats.org/drawingml/2006/main">
+                <a:graphicData uri="http://schemas.openxmlformats.org/drawingml/2006/picture">
+                  <pic:pic xmlns:pic="http://schemas.openxmlformats.org/drawingml/2006/picture">
+                    <pic:nvPicPr>
+                      <pic:cNvPr id="2064367550" name="Picture 2064367550"/>
+                      <pic:cNvPicPr/>
+                    </pic:nvPicPr>
+                    <pic:blipFill>
+                      <a:blip r:embed="rId27" cstate="print">
+                        <a:extLst>
+                          <a:ext uri="{28A0092B-C50C-407E-A947-70E740481C1C}">
+                            <a14:useLocalDpi xmlns:a14="http://schemas.microsoft.com/office/drawing/2010/main" val="0"/>
+                          </a:ext>
+                        </a:extLst>
+                      </a:blip>
+                      <a:stretch>
+                        <a:fillRect/>
+                      </a:stretch>
+                    </pic:blipFill>
+                    <pic:spPr>
+                      <a:xfrm>
+                        <a:off x="0" y="0"/>
+                        <a:ext cx="5486674" cy="2827130"/>
+                      </a:xfrm>
+                      <a:prstGeom prst="rect">
+                        <a:avLst/>
+                      </a:prstGeom>
+                    </pic:spPr>
+                  </pic:pic>
+                </a:graphicData>
+              </a:graphic>
+            </wp:inline>
+          </w:drawing>
+        </w:r>
+      </w:ins>
+      <w:del w:id="112" w:author="Angel David Ramirez Romero" w:date="2026-06-10T14:21:00Z" w16du:dateUtc="2026-06-10T18:21:00Z">
+        <w:r>
+          <w:rPr>
+            <w:noProof/>
+            <w:lang w:val="en-GB"/>
+          </w:rPr>
+          <w:drawing>
+            <wp:inline distT="0" distB="0" distL="0" distR="0" wp14:anchorId="0CE2C5C4" wp14:editId="074B03FE">
+              <wp:extent cx="6011141" cy="5115172"/>
+              <wp:effectExtent l="0" t="0" r="0" b="0"/>
+              <wp:docPr id="760464022" name="Picture 10"/>
+              <wp:cNvGraphicFramePr/>
+              <a:graphic xmlns:a="http://schemas.openxmlformats.org/drawingml/2006/main">
+                <a:graphicData uri="http://schemas.openxmlformats.org/drawingml/2006/picture">
+                  <pic:pic xmlns:pic="http://schemas.openxmlformats.org/drawingml/2006/picture">
+                    <pic:nvPicPr>
+                      <pic:cNvPr id="760464022" name="Picture 10"/>
+                      <pic:cNvPicPr/>
+                    </pic:nvPicPr>
+                    <pic:blipFill>
+                      <a:blip r:embed="rId28"/>
+                      <a:stretch>
+                        <a:fillRect/>
+                      </a:stretch>
+                    </pic:blipFill>
+                    <pic:spPr>
+                      <a:xfrm>
+                        <a:off x="0" y="0"/>
+                        <a:ext cx="6011141" cy="5115172"/>
+                      </a:xfrm>
+                      <a:prstGeom prst="rect">
+                        <a:avLst/>
+                      </a:prstGeom>
+                    </pic:spPr>
+                  </pic:pic>
+                </a:graphicData>
+              </a:graphic>
+            </wp:inline>
+          </w:drawing>
+        </w:r>
+      </w:del>
+      <w:ins w:id="113" w:author="Angel David Ramirez Romero" w:date="2026-06-10T14:21:00Z" w16du:dateUtc="2026-06-10T18:21:00Z">
+        <w:del w:id="114" w:author="Angel David Ramirez Romero [2]" w:date="2026-06-11T16:52:00Z" w16du:dateUtc="2026-06-11T20:52:00Z">
+          <w:r>
+            <w:rPr>
+              <w:i/>
+              <w:noProof/>
+              <w:lang w:val="en-GB"/>
+            </w:rPr>
+            <w:drawing>
+              <wp:inline distT="0" distB="0" distL="0" distR="0" wp14:anchorId="6A883FAE" wp14:editId="173DFD58">
+                <wp:extent cx="5072932" cy="3032956"/>
+                <wp:effectExtent l="0" t="0" r="0" b="0"/>
+                <wp:docPr id="965674214" name="Picture 21"/>
+                <wp:cNvGraphicFramePr>
+                  <a:graphicFrameLocks xmlns:a="http://schemas.openxmlformats.org/drawingml/2006/main" noChangeAspect="1"/>
+                </wp:cNvGraphicFramePr>
+                <a:graphic xmlns:a="http://schemas.openxmlformats.org/drawingml/2006/main">
+                  <a:graphicData uri="http://schemas.openxmlformats.org/drawingml/2006/picture">
+                    <pic:pic xmlns:pic="http://schemas.openxmlformats.org/drawingml/2006/picture">
+                      <pic:nvPicPr>
+                        <pic:cNvPr id="965674214" name="Picture 965674214"/>
+                        <pic:cNvPicPr/>
+                      </pic:nvPicPr>
+                      <pic:blipFill>
+                        <a:blip r:embed="rId29" cstate="print">
+                          <a:extLst>
+                            <a:ext uri="{28A0092B-C50C-407E-A947-70E740481C1C}">
+                              <a14:useLocalDpi xmlns:a14="http://schemas.microsoft.com/office/drawing/2010/main" val="0"/>
+                            </a:ext>
+                          </a:extLst>
+                        </a:blip>
+                        <a:stretch>
+                          <a:fillRect/>
+                        </a:stretch>
+                      </pic:blipFill>
+                      <pic:spPr>
+                        <a:xfrm>
+                          <a:off x="0" y="0"/>
+                          <a:ext cx="5079972" cy="3037165"/>
+                        </a:xfrm>
+                        <a:prstGeom prst="rect">
+                          <a:avLst/>
+                        </a:prstGeom>
+                      </pic:spPr>
+                    </pic:pic>
+                  </a:graphicData>
+                </a:graphic>
+              </wp:inline>
+            </w:drawing>
+          </w:r>
+        </w:del>
+      </w:ins>
     </w:p>
     <w:p>
       <w:pPr>
@@ -7282,6 +8831,7 @@
         <w:pStyle w:val="Heading4"/>
       </w:pPr>
       <w:r>
+        <w:lastRenderedPageBreak/>
         <w:t>Trust in judges and magistrates</w:t>
       </w:r>
     </w:p>
@@ -7341,7 +8891,29 @@
         <w:rPr>
           <w:lang w:val="en-US"/>
         </w:rPr>
-        <w:t xml:space="preserve"> trust in judges and magistrates. While this suggests a moderate level of trust in the judiciary, it also points to a significant degree of public scepticism. Trust in judges remains below the EU average of 57%, underscoring a gap between Malta and many other member states </w:t>
+        <w:t xml:space="preserve"> trust in judges and magistrates. While this suggests a moderate level of trust in the judiciary, it also points to a significant degree of public </w:t>
+      </w:r>
+      <w:del w:id="115" w:author="Angel David Ramirez Romero" w:date="2026-06-10T14:12:00Z" w16du:dateUtc="2026-06-10T18:12:00Z">
+        <w:r>
+          <w:rPr>
+            <w:lang w:val="en-US"/>
+          </w:rPr>
+          <w:delText>scepticism</w:delText>
+        </w:r>
+      </w:del>
+      <w:ins w:id="116" w:author="Angel David Ramirez Romero" w:date="2026-06-10T14:12:00Z" w16du:dateUtc="2026-06-10T18:12:00Z">
+        <w:r>
+          <w:rPr>
+            <w:lang w:val="en-US"/>
+          </w:rPr>
+          <w:t>skepticism</w:t>
+        </w:r>
+      </w:ins>
+      <w:r>
+        <w:rPr>
+          <w:lang w:val="en-US"/>
+        </w:rPr>
+        <w:t xml:space="preserve">. Trust in judges remains below the EU average of 57%, underscoring a gap between Malta and many other member states </w:t>
       </w:r>
       <w:sdt>
         <w:sdtPr>
@@ -7400,24 +8972,27 @@
         </w:rPr>
         <w:t>Levels of trust are unevenly distributed across the population. Men report lower trust in judges than women (5</w:t>
       </w:r>
-      <w:r>
-        <w:rPr>
-          <w:lang w:val="en-US"/>
-        </w:rPr>
-        <w:t>4</w:t>
-      </w:r>
-      <w:r>
-        <w:rPr>
-          <w:lang w:val="en-US"/>
-        </w:rPr>
-        <w:t xml:space="preserve">% compared to 57%). Financial circumstances also appear to be a particularly strong determinant, as only 35% of those in a constrained financial situation reported trust in judges, compared to 59% among those in a more secure economic position. In addition, prior interaction with the justice system influences </w:t>
-      </w:r>
-      <w:r>
-        <w:rPr>
-          <w:lang w:val="en-US"/>
-        </w:rPr>
-        <w:lastRenderedPageBreak/>
-        <w:t xml:space="preserve">perceptions: people who have experienced a </w:t>
+      <w:ins w:id="117" w:author="Angel David Ramirez Romero" w:date="2026-06-10T14:13:00Z" w16du:dateUtc="2026-06-10T18:13:00Z">
+        <w:r>
+          <w:rPr>
+            <w:lang w:val="en-US"/>
+          </w:rPr>
+          <w:t>3</w:t>
+        </w:r>
+      </w:ins>
+      <w:del w:id="118" w:author="Angel David Ramirez Romero" w:date="2026-06-10T14:13:00Z" w16du:dateUtc="2026-06-10T18:13:00Z">
+        <w:r>
+          <w:rPr>
+            <w:lang w:val="en-US"/>
+          </w:rPr>
+          <w:delText>4</w:delText>
+        </w:r>
+      </w:del>
+      <w:r>
+        <w:rPr>
+          <w:lang w:val="en-US"/>
+        </w:rPr>
+        <w:t xml:space="preserve">% compared to 57%). Financial circumstances also appear to be a particularly strong determinant, as only 35% of those in a constrained financial situation reported trust in judges, compared to 59% among those in a more secure economic position. In addition, prior interaction with the justice system influences perceptions: people who have experienced a </w:t>
       </w:r>
       <w:r>
         <w:rPr>
@@ -7566,7 +9141,21 @@
         <w:rPr>
           <w:lang w:val="en-US"/>
         </w:rPr>
-        <w:t xml:space="preserve"> trust. In this area as well, Malta falls fairly short the EU average of 57%, ranking 23</w:t>
+        <w:t xml:space="preserve"> trust. In this area as well, Malta falls </w:t>
+      </w:r>
+      <w:proofErr w:type="gramStart"/>
+      <w:r>
+        <w:rPr>
+          <w:lang w:val="en-US"/>
+        </w:rPr>
+        <w:t>fairly short</w:t>
+      </w:r>
+      <w:proofErr w:type="gramEnd"/>
+      <w:r>
+        <w:rPr>
+          <w:lang w:val="en-US"/>
+        </w:rPr>
+        <w:t xml:space="preserve"> the EU average of 57%, ranking 23</w:t>
       </w:r>
       <w:r>
         <w:rPr>
@@ -7590,7 +9179,21 @@
         <w:rPr>
           <w:lang w:val="en-US"/>
         </w:rPr>
-        <w:t>Patterns of inequality in trust are similar to those observed for judges. People in financially constrained situations report substantially lower trust in prosecutors (3</w:t>
+        <w:t xml:space="preserve">Patterns of inequality in trust are </w:t>
+      </w:r>
+      <w:proofErr w:type="gramStart"/>
+      <w:r>
+        <w:rPr>
+          <w:lang w:val="en-US"/>
+        </w:rPr>
+        <w:t>similar to</w:t>
+      </w:r>
+      <w:proofErr w:type="gramEnd"/>
+      <w:r>
+        <w:rPr>
+          <w:lang w:val="en-US"/>
+        </w:rPr>
+        <w:t xml:space="preserve"> those observed for judges. People in financially constrained situations report substantially lower trust in prosecutors (3</w:t>
       </w:r>
       <w:r>
         <w:rPr>
@@ -7675,7 +9278,21 @@
         <w:rPr>
           <w:lang w:val="en-US"/>
         </w:rPr>
-        <w:t>Trust in public defence attorneys</w:t>
+        <w:t xml:space="preserve">Trust in public </w:t>
+      </w:r>
+      <w:proofErr w:type="spellStart"/>
+      <w:r>
+        <w:rPr>
+          <w:lang w:val="en-US"/>
+        </w:rPr>
+        <w:t>defence</w:t>
+      </w:r>
+      <w:proofErr w:type="spellEnd"/>
+      <w:r>
+        <w:rPr>
+          <w:lang w:val="en-US"/>
+        </w:rPr>
+        <w:t xml:space="preserve"> attorneys</w:t>
       </w:r>
     </w:p>
     <w:p>
@@ -7687,7 +9304,23 @@
           <w:rFonts w:eastAsiaTheme="minorEastAsia"/>
           <w:lang w:val="en-US"/>
         </w:rPr>
-        <w:t xml:space="preserve">Trust in public defence attorneys is higher than trust in prosecutors but lower than trust in judges. 53% of people report having </w:t>
+        <w:t xml:space="preserve">Trust in public </w:t>
+      </w:r>
+      <w:proofErr w:type="spellStart"/>
+      <w:r>
+        <w:rPr>
+          <w:rFonts w:eastAsiaTheme="minorEastAsia"/>
+          <w:lang w:val="en-US"/>
+        </w:rPr>
+        <w:t>defence</w:t>
+      </w:r>
+      <w:proofErr w:type="spellEnd"/>
+      <w:r>
+        <w:rPr>
+          <w:rFonts w:eastAsiaTheme="minorEastAsia"/>
+          <w:lang w:val="en-US"/>
+        </w:rPr>
+        <w:t xml:space="preserve"> attorneys is higher than trust in prosecutors but lower than trust in judges. 53% of people report having </w:t>
       </w:r>
       <w:r>
         <w:rPr>
@@ -7735,7 +9368,21 @@
         <w:rPr>
           <w:lang w:val="en-US"/>
         </w:rPr>
-        <w:t xml:space="preserve"> trust in public defence attorneys, placing Malta in line with the EU average of 52%. </w:t>
+        <w:t xml:space="preserve"> trust in public </w:t>
+      </w:r>
+      <w:proofErr w:type="spellStart"/>
+      <w:r>
+        <w:rPr>
+          <w:lang w:val="en-US"/>
+        </w:rPr>
+        <w:t>defence</w:t>
+      </w:r>
+      <w:proofErr w:type="spellEnd"/>
+      <w:r>
+        <w:rPr>
+          <w:lang w:val="en-US"/>
+        </w:rPr>
+        <w:t xml:space="preserve"> attorneys, placing Malta in line with the EU average of 52%. </w:t>
       </w:r>
     </w:p>
     <w:p>
@@ -7746,12 +9393,71 @@
           <w:lang w:val="en-US"/>
         </w:rPr>
       </w:pPr>
+      <w:proofErr w:type="gramStart"/>
       <w:r>
         <w:rPr>
           <w:rFonts w:eastAsiaTheme="minorEastAsia"/>
           <w:lang w:val="en-US"/>
         </w:rPr>
-        <w:t>Similar to patterns observed for other justice actors, trust levels are lower among individuals facing financial constraints (40%) than among those in more secure situations (58%). Prior experience with a serious justice problem is once again associated with reduced trust, affecting 46% of those with such experience compared to 58% among those without</w:t>
+        <w:t>Similar to</w:t>
+      </w:r>
+      <w:proofErr w:type="gramEnd"/>
+      <w:r>
+        <w:rPr>
+          <w:rFonts w:eastAsiaTheme="minorEastAsia"/>
+          <w:lang w:val="en-US"/>
+        </w:rPr>
+        <w:t xml:space="preserve"> patterns observed for other justice actors, trust levels are lower among individuals facing financial constraints (40%) than among those in more secure situations (5</w:t>
+      </w:r>
+      <w:ins w:id="119" w:author="Angel David Ramirez Romero" w:date="2026-06-10T14:15:00Z" w16du:dateUtc="2026-06-10T18:15:00Z">
+        <w:r>
+          <w:rPr>
+            <w:rFonts w:eastAsiaTheme="minorEastAsia"/>
+            <w:lang w:val="en-US"/>
+          </w:rPr>
+          <w:t>5</w:t>
+        </w:r>
+      </w:ins>
+      <w:del w:id="120" w:author="Angel David Ramirez Romero" w:date="2026-06-10T14:15:00Z" w16du:dateUtc="2026-06-10T18:15:00Z">
+        <w:r>
+          <w:rPr>
+            <w:rFonts w:eastAsiaTheme="minorEastAsia"/>
+            <w:lang w:val="en-US"/>
+          </w:rPr>
+          <w:delText>8</w:delText>
+        </w:r>
+      </w:del>
+      <w:r>
+        <w:rPr>
+          <w:rFonts w:eastAsiaTheme="minorEastAsia"/>
+          <w:lang w:val="en-US"/>
+        </w:rPr>
+        <w:t>%). Prior experience with a serious justice problem is once again associated with reduced trust, affecting 4</w:t>
+      </w:r>
+      <w:ins w:id="121" w:author="Angel David Ramirez Romero" w:date="2026-06-10T14:15:00Z" w16du:dateUtc="2026-06-10T18:15:00Z">
+        <w:r>
+          <w:rPr>
+            <w:rFonts w:eastAsiaTheme="minorEastAsia"/>
+            <w:lang w:val="en-US"/>
+          </w:rPr>
+          <w:t>7</w:t>
+        </w:r>
+      </w:ins>
+      <w:del w:id="122" w:author="Angel David Ramirez Romero" w:date="2026-06-10T14:15:00Z" w16du:dateUtc="2026-06-10T18:15:00Z">
+        <w:r>
+          <w:rPr>
+            <w:rFonts w:eastAsiaTheme="minorEastAsia"/>
+            <w:lang w:val="en-US"/>
+          </w:rPr>
+          <w:delText>6</w:delText>
+        </w:r>
+      </w:del>
+      <w:r>
+        <w:rPr>
+          <w:rFonts w:eastAsiaTheme="minorEastAsia"/>
+          <w:lang w:val="en-US"/>
+        </w:rPr>
+        <w:t>% of those with such experience compared to 58% among those without</w:t>
       </w:r>
       <w:sdt>
         <w:sdtPr>
@@ -7820,12 +9526,12 @@
       </w:r>
     </w:p>
     <w:sectPr>
-      <w:headerReference w:type="even" r:id="rId19"/>
-      <w:headerReference w:type="default" r:id="rId20"/>
-      <w:footerReference w:type="even" r:id="rId21"/>
-      <w:footerReference w:type="default" r:id="rId22"/>
-      <w:headerReference w:type="first" r:id="rId23"/>
-      <w:footerReference w:type="first" r:id="rId24"/>
+      <w:headerReference w:type="even" r:id="rId30"/>
+      <w:headerReference w:type="default" r:id="rId31"/>
+      <w:footerReference w:type="even" r:id="rId32"/>
+      <w:footerReference w:type="default" r:id="rId33"/>
+      <w:headerReference w:type="first" r:id="rId34"/>
+      <w:footerReference w:type="first" r:id="rId35"/>
       <w:endnotePr>
         <w:numFmt w:val="decimal"/>
         <w:numRestart w:val="eachSect"/>
@@ -7953,7 +9659,7 @@
               <v:stroke joinstyle="miter"/>
               <v:path gradientshapeok="t" o:connecttype="rect"/>
             </v:shapetype>
-            <v:shape id="Text Box 5" o:spid="_x0000_s1026" type="#_x0000_t202" alt="Restricted Use - À usage restreint" style="position:absolute;left:0;text-align:left;margin-left:0;margin-top:0;width:135.45pt;height:27.2pt;z-index:251658241;visibility:visible;mso-wrap-style:none;mso-wrap-distance-left:0;mso-wrap-distance-top:0;mso-wrap-distance-right:0;mso-wrap-distance-bottom:0;mso-position-horizontal:center;mso-position-horizontal-relative:page;mso-position-vertical:bottom;mso-position-vertical-relative:page;v-text-anchor:bottom" o:gfxdata="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" filled="f" stroked="f">
+            <v:shape id="Text Box 5" o:spid="_x0000_s1026" type="#_x0000_t202" alt="Restricted Use - À usage restreint" style="position:absolute;left:0;text-align:left;margin-left:0;margin-top:0;width:135.45pt;height:27.2pt;z-index:251658241;visibility:visible;mso-wrap-style:none;mso-wrap-distance-left:0;mso-wrap-distance-top:0;mso-wrap-distance-right:0;mso-wrap-distance-bottom:0;mso-position-horizontal:center;mso-position-horizontal-relative:page;mso-position-vertical:bottom;mso-position-vertical-relative:page;v-text-anchor:bottom" o:gfxdata="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" filled="f" stroked="f">
               <v:textbox style="mso-fit-shape-to-text:t" inset="0,0,0,15pt">
                 <w:txbxContent>
                   <w:p>
@@ -8126,7 +9832,7 @@
               <v:stroke joinstyle="miter"/>
               <v:path gradientshapeok="t" o:connecttype="rect"/>
             </v:shapetype>
-            <v:shape id="Text Box 6" o:spid="_x0000_s1027" type="#_x0000_t202" alt="Restricted Use - À usage restreint" style="position:absolute;margin-left:0;margin-top:0;width:135.45pt;height:27.2pt;z-index:251658242;visibility:visible;mso-wrap-style:none;mso-wrap-distance-left:0;mso-wrap-distance-top:0;mso-wrap-distance-right:0;mso-wrap-distance-bottom:0;mso-position-horizontal:center;mso-position-horizontal-relative:page;mso-position-vertical:bottom;mso-position-vertical-relative:page;v-text-anchor:bottom" o:gfxdata="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" filled="f" stroked="f">
+            <v:shape id="Text Box 6" o:spid="_x0000_s1027" type="#_x0000_t202" alt="Restricted Use - À usage restreint" style="position:absolute;margin-left:0;margin-top:0;width:135.45pt;height:27.2pt;z-index:251658242;visibility:visible;mso-wrap-style:none;mso-wrap-distance-left:0;mso-wrap-distance-top:0;mso-wrap-distance-right:0;mso-wrap-distance-bottom:0;mso-position-horizontal:center;mso-position-horizontal-relative:page;mso-position-vertical:bottom;mso-position-vertical-relative:page;v-text-anchor:bottom" o:gfxdata="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" filled="f" stroked="f">
               <v:textbox style="mso-fit-shape-to-text:t" inset="0,0,0,15pt">
                 <w:txbxContent>
                   <w:p>
@@ -8300,7 +10006,7 @@
               <v:stroke joinstyle="miter"/>
               <v:path gradientshapeok="t" o:connecttype="rect"/>
             </v:shapetype>
-            <v:shape id="Text Box 4" o:spid="_x0000_s1028" type="#_x0000_t202" alt="Restricted Use - À usage restreint" style="position:absolute;left:0;text-align:left;margin-left:0;margin-top:0;width:135.45pt;height:27.2pt;z-index:251658240;visibility:visible;mso-wrap-style:none;mso-wrap-distance-left:0;mso-wrap-distance-top:0;mso-wrap-distance-right:0;mso-wrap-distance-bottom:0;mso-position-horizontal:center;mso-position-horizontal-relative:page;mso-position-vertical:bottom;mso-position-vertical-relative:page;v-text-anchor:bottom" o:gfxdata="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" filled="f" stroked="f">
+            <v:shape id="Text Box 4" o:spid="_x0000_s1028" type="#_x0000_t202" alt="Restricted Use - À usage restreint" style="position:absolute;left:0;text-align:left;margin-left:0;margin-top:0;width:135.45pt;height:27.2pt;z-index:251658240;visibility:visible;mso-wrap-style:none;mso-wrap-distance-left:0;mso-wrap-distance-top:0;mso-wrap-distance-right:0;mso-wrap-distance-bottom:0;mso-position-horizontal:center;mso-position-horizontal-relative:page;mso-position-vertical:bottom;mso-position-vertical-relative:page;v-text-anchor:bottom" o:gfxdata="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" filled="f" stroked="f">
               <v:textbox style="mso-fit-shape-to-text:t" inset="0,0,0,15pt">
                 <w:txbxContent>
                   <w:p>
@@ -8410,7 +10116,15 @@
         <w:t xml:space="preserve"> </w:t>
       </w:r>
       <w:r>
-        <w:t>People in a financially constrained situation are those who answered that money is not enough to cover all their basic necessities and/or clothes when asked to describe their household financial situation.</w:t>
+        <w:t xml:space="preserve">People in a financially constrained situation are those who answered that money is not enough to cover all their </w:t>
+      </w:r>
+      <w:proofErr w:type="gramStart"/>
+      <w:r>
+        <w:t>basic necessities</w:t>
+      </w:r>
+      <w:proofErr w:type="gramEnd"/>
+      <w:r>
+        <w:t xml:space="preserve"> and/or clothes when asked to describe their household financial situation.</w:t>
       </w:r>
     </w:p>
   </w:footnote>
@@ -8457,7 +10171,21 @@
         <w:rPr>
           <w:lang w:val="en-US"/>
         </w:rPr>
-        <w:t>ndividuals who have attended law school or work for an organisation that provides legal advice</w:t>
+        <w:t xml:space="preserve">ndividuals who have attended law school or work for an </w:t>
+      </w:r>
+      <w:proofErr w:type="spellStart"/>
+      <w:r>
+        <w:rPr>
+          <w:lang w:val="en-US"/>
+        </w:rPr>
+        <w:t>organisation</w:t>
+      </w:r>
+      <w:proofErr w:type="spellEnd"/>
+      <w:r>
+        <w:rPr>
+          <w:lang w:val="en-US"/>
+        </w:rPr>
+        <w:t xml:space="preserve"> that provides legal advice</w:t>
       </w:r>
     </w:p>
   </w:footnote>
@@ -16203,6 +17931,20 @@
   </w:num>
   <w:numIdMacAtCleanup w:val="59"/>
 </w:numbering>
+</file>
+
+<file path=word/people.xml><?xml version="1.0" encoding="utf-8"?>
+<w15:people xmlns:wpc="http://schemas.microsoft.com/office/word/2010/wordprocessingCanvas" xmlns:cx="http://schemas.microsoft.com/office/drawing/2014/chartex" xmlns:cx1="http://schemas.microsoft.com/office/drawing/2015/9/8/chartex" xmlns:cx2="http://schemas.microsoft.com/office/drawing/2015/10/21/chartex" xmlns:cx3="http://schemas.microsoft.com/office/drawing/2016/5/9/chartex" xmlns:cx4="http://schemas.microsoft.com/office/drawing/2016/5/10/chartex" xmlns:cx5="http://schemas.microsoft.com/office/drawing/2016/5/11/chartex" xmlns:cx6="http://schemas.microsoft.com/office/drawing/2016/5/12/chartex" xmlns:cx7="http://schemas.microsoft.com/office/drawing/2016/5/13/chartex" xmlns:cx8="http://schemas.microsoft.com/office/drawing/2016/5/14/chartex" xmlns:mc="http://schemas.openxmlformats.org/markup-compatibility/2006" xmlns:aink="http://schemas.microsoft.com/office/drawing/2016/ink" xmlns:am3d="http://schemas.microsoft.com/office/drawing/2017/model3d" xmlns:o="urn:schemas-microsoft-com:office:office" xmlns:oel="http://schemas.microsoft.com/office/2019/extlst" xmlns:r="http://schemas.openxmlformats.org/officeDocument/2006/relationships" xmlns:m="http://schemas.openxmlformats.org/officeDocument/2006/math" xmlns:v="urn:schemas-microsoft-com:vml" xmlns:wp14="http://schemas.microsoft.com/office/word/2010/wordprocessingDrawing" xmlns:wp="http://schemas.openxmlformats.org/drawingml/2006/wordprocessingDrawing" xmlns:w10="urn:schemas-microsoft-com:office:word" xmlns:w="http://schemas.openxmlformats.org/wordprocessingml/2006/main" xmlns:w14="http://schemas.microsoft.com/office/word/2010/wordml" xmlns:w15="http://schemas.microsoft.com/office/word/2012/wordml" xmlns:w16cex="http://schemas.microsoft.com/office/word/2018/wordml/cex" xmlns:w16cid="http://schemas.microsoft.com/office/word/2016/wordml/cid" xmlns:w16="http://schemas.microsoft.com/office/word/2018/wordml" xmlns:w16du="http://schemas.microsoft.com/office/word/2023/wordml/word16du" xmlns:w16sdtdh="http://schemas.microsoft.com/office/word/2020/wordml/sdtdatahash" xmlns:w16sdtfl="http://schemas.microsoft.com/office/word/2024/wordml/sdtformatlock" xmlns:w16se="http://schemas.microsoft.com/office/word/2015/wordml/symex" xmlns:wpg="http://schemas.microsoft.com/office/word/2010/wordprocessingGroup" xmlns:wpi="http://schemas.microsoft.com/office/word/2010/wordprocessingInk" xmlns:wne="http://schemas.microsoft.com/office/word/2006/wordml" xmlns:wps="http://schemas.microsoft.com/office/word/2010/wordprocessingShape" mc:Ignorable="w14 w15 w16se w16cid w16 w16cex w16sdtdh w16sdtfl w16du wp14">
+  <w15:person w15:author="Angel David Ramirez Romero">
+    <w15:presenceInfo w15:providerId="AD" w15:userId="S::ad.ramirezr12@uniandes.edu.co::ed0e04da-6bfd-4b27-a8e3-dedb3200afff"/>
+  </w15:person>
+  <w15:person w15:author="Santiago Pardo">
+    <w15:presenceInfo w15:providerId="AD" w15:userId="S::spardo@worldjusticeproject.org::b65fc5c1-58fc-4bac-a2fc-91e6d6252c0d"/>
+  </w15:person>
+  <w15:person w15:author="Angel David Ramirez Romero [2]">
+    <w15:presenceInfo w15:providerId="AD" w15:userId="S::adramirezromero@worldjusticeproject.org::87ffcb80-1747-40ae-8e42-f3f35bf48bb5"/>
+  </w15:person>
+</w15:people>
 </file>
 
 <file path=word/styles.xml><?xml version="1.0" encoding="utf-8"?>
@@ -19088,6 +20830,15 @@
 </file>
 
 <file path=customXml/item1.xml><?xml version="1.0" encoding="utf-8"?>
+<?mso-contentType ?>
+<FormTemplates xmlns="http://schemas.microsoft.com/sharepoint/v3/contenttype/forms">
+  <Display>DocumentLibraryForm</Display>
+  <Edit>DocumentLibraryForm</Edit>
+  <New>DocumentLibraryForm</New>
+</FormTemplates>
+</file>
+
+<file path=customXml/item2.xml><?xml version="1.0" encoding="utf-8"?>
 <p:properties xmlns:p="http://schemas.microsoft.com/office/2006/metadata/properties" xmlns:xsi="http://www.w3.org/2001/XMLSchema-instance" xmlns:pc="http://schemas.microsoft.com/office/infopath/2007/PartnerControls">
   <documentManagement>
     <lcf76f155ced4ddcb4097134ff3c332f xmlns="46f3a809-46a3-44ee-a0f1-42a271529c86">
@@ -19098,7 +20849,7 @@
 </p:properties>
 </file>
 
-<file path=customXml/item2.xml><?xml version="1.0" encoding="utf-8"?>
+<file path=customXml/item3.xml><?xml version="1.0" encoding="utf-8"?>
 <b:Sources xmlns:b="http://schemas.openxmlformats.org/officeDocument/2006/bibliography" xmlns="http://schemas.openxmlformats.org/officeDocument/2006/bibliography" SelectedStyle="\oecd-en.xsl" StyleName="OECD English" Version="20220221">
   <b:Source>
     <b:Tag>OEC24</b:Tag>
@@ -20331,9 +22082,9 @@
 </b:Sources>
 </file>
 
-<file path=customXml/item3.xml><?xml version="1.0" encoding="utf-8"?>
-<ct:contentTypeSchema xmlns:ct="http://schemas.microsoft.com/office/2006/metadata/contentType" xmlns:ma="http://schemas.microsoft.com/office/2006/metadata/properties/metaAttributes" ct:_="" ma:_="" ma:contentTypeName="Documento" ma:contentTypeID="0x0101006BF094976B1C6245BAB5BCECAC284645" ma:contentTypeVersion="17" ma:contentTypeDescription="Crear nuevo documento." ma:contentTypeScope="" ma:versionID="de659102f67f900a4507bbf2a4959426">
-  <xsd:schema xmlns:xsd="http://www.w3.org/2001/XMLSchema" xmlns:xs="http://www.w3.org/2001/XMLSchema" xmlns:p="http://schemas.microsoft.com/office/2006/metadata/properties" xmlns:ns2="69276225-f05c-44c5-92dc-c999460a4149" xmlns:ns3="46f3a809-46a3-44ee-a0f1-42a271529c86" targetNamespace="http://schemas.microsoft.com/office/2006/metadata/properties" ma:root="true" ma:fieldsID="9b8ee336b2a1d24b8ead4191187077de" ns2:_="" ns3:_="">
+<file path=customXml/item4.xml><?xml version="1.0" encoding="utf-8"?>
+<ct:contentTypeSchema xmlns:ct="http://schemas.microsoft.com/office/2006/metadata/contentType" xmlns:ma="http://schemas.microsoft.com/office/2006/metadata/properties/metaAttributes" ct:_="" ma:_="" ma:contentTypeName="Document" ma:contentTypeID="0x0101006BF094976B1C6245BAB5BCECAC284645" ma:contentTypeVersion="17" ma:contentTypeDescription="Create a new document." ma:contentTypeScope="" ma:versionID="347dc9eaee87b4cbb901bc584e0b214d">
+  <xsd:schema xmlns:xsd="http://www.w3.org/2001/XMLSchema" xmlns:xs="http://www.w3.org/2001/XMLSchema" xmlns:p="http://schemas.microsoft.com/office/2006/metadata/properties" xmlns:ns2="69276225-f05c-44c5-92dc-c999460a4149" xmlns:ns3="46f3a809-46a3-44ee-a0f1-42a271529c86" targetNamespace="http://schemas.microsoft.com/office/2006/metadata/properties" ma:root="true" ma:fieldsID="32796ae3933d308c0b8b72e1382e1089" ns2:_="" ns3:_="">
     <xsd:import namespace="69276225-f05c-44c5-92dc-c999460a4149"/>
     <xsd:import namespace="46f3a809-46a3-44ee-a0f1-42a271529c86"/>
     <xsd:element name="properties">
@@ -20368,7 +22119,7 @@
   <xsd:schema xmlns:xsd="http://www.w3.org/2001/XMLSchema" xmlns:xs="http://www.w3.org/2001/XMLSchema" xmlns:dms="http://schemas.microsoft.com/office/2006/documentManagement/types" xmlns:pc="http://schemas.microsoft.com/office/infopath/2007/PartnerControls" targetNamespace="69276225-f05c-44c5-92dc-c999460a4149" elementFormDefault="qualified">
     <xsd:import namespace="http://schemas.microsoft.com/office/2006/documentManagement/types"/>
     <xsd:import namespace="http://schemas.microsoft.com/office/infopath/2007/PartnerControls"/>
-    <xsd:element name="SharedWithUsers" ma:index="8" nillable="true" ma:displayName="Compartido con" ma:internalName="SharedWithUsers" ma:readOnly="true">
+    <xsd:element name="SharedWithUsers" ma:index="8" nillable="true" ma:displayName="Shared With" ma:internalName="SharedWithUsers" ma:readOnly="true">
       <xsd:complexType>
         <xsd:complexContent>
           <xsd:extension base="dms:UserMulti">
@@ -20387,7 +22138,7 @@
         </xsd:complexContent>
       </xsd:complexType>
     </xsd:element>
-    <xsd:element name="SharedWithDetails" ma:index="9" nillable="true" ma:displayName="Detalles de uso compartido" ma:internalName="SharedWithDetails" ma:readOnly="true">
+    <xsd:element name="SharedWithDetails" ma:index="9" nillable="true" ma:displayName="Shared With Details" ma:internalName="SharedWithDetails" ma:readOnly="true">
       <xsd:simpleType>
         <xsd:restriction base="dms:Note">
           <xsd:maxLength value="255"/>
@@ -20419,7 +22170,7 @@
         <xsd:restriction base="dms:Note"/>
       </xsd:simpleType>
     </xsd:element>
-    <xsd:element name="lcf76f155ced4ddcb4097134ff3c332f" ma:index="13" nillable="true" ma:taxonomy="true" ma:internalName="lcf76f155ced4ddcb4097134ff3c332f" ma:taxonomyFieldName="MediaServiceImageTags" ma:displayName="Etiquetas de imagen" ma:readOnly="false" ma:fieldId="{5cf76f15-5ced-4ddc-b409-7134ff3c332f}" ma:taxonomyMulti="true" ma:sspId="c40d4899-0986-466d-9443-4d7b8518a0f2" ma:termSetId="09814cd3-568e-fe90-9814-8d621ff8fb84" ma:anchorId="fba54fb3-c3e1-fe81-a776-ca4b69148c4d" ma:open="true" ma:isKeyword="false">
+    <xsd:element name="lcf76f155ced4ddcb4097134ff3c332f" ma:index="13" nillable="true" ma:taxonomy="true" ma:internalName="lcf76f155ced4ddcb4097134ff3c332f" ma:taxonomyFieldName="MediaServiceImageTags" ma:displayName="Image Tags" ma:readOnly="false" ma:fieldId="{5cf76f15-5ced-4ddc-b409-7134ff3c332f}" ma:taxonomyMulti="true" ma:sspId="c40d4899-0986-466d-9443-4d7b8518a0f2" ma:termSetId="09814cd3-568e-fe90-9814-8d621ff8fb84" ma:anchorId="fba54fb3-c3e1-fe81-a776-ca4b69148c4d" ma:open="true" ma:isKeyword="false">
       <xsd:complexType>
         <xsd:sequence>
           <xsd:element ref="pc:Terms" minOccurs="0" maxOccurs="1"/>
@@ -20490,8 +22241,8 @@
         <xsd:element ref="dc:creator" minOccurs="0" maxOccurs="1"/>
         <xsd:element ref="dcterms:created" minOccurs="0" maxOccurs="1"/>
         <xsd:element ref="dc:identifier" minOccurs="0" maxOccurs="1"/>
-        <xsd:element name="contentType" minOccurs="0" maxOccurs="1" type="xsd:string" ma:index="0" ma:displayName="Tipo de contenido"/>
-        <xsd:element ref="dc:title" minOccurs="0" maxOccurs="1" ma:index="4" ma:displayName="Título"/>
+        <xsd:element name="contentType" minOccurs="0" maxOccurs="1" type="xsd:string" ma:index="0" ma:displayName="Content Type"/>
+        <xsd:element ref="dc:title" minOccurs="0" maxOccurs="1" ma:index="4" ma:displayName="Title"/>
         <xsd:element ref="dc:subject" minOccurs="0" maxOccurs="1"/>
         <xsd:element ref="dc:description" minOccurs="0" maxOccurs="1"/>
         <xsd:element name="keywords" minOccurs="0" maxOccurs="1" type="xsd:string"/>
@@ -20580,25 +22331,26 @@
 </ct:contentTypeSchema>
 </file>
 
-<file path=customXml/item4.xml><?xml version="1.0" encoding="utf-8"?>
-<?mso-contentType ?>
-<FormTemplates xmlns="http://schemas.microsoft.com/sharepoint/v3/contenttype/forms">
-  <Display>DocumentLibraryForm</Display>
-  <Edit>DocumentLibraryForm</Edit>
-  <New>DocumentLibraryForm</New>
-</FormTemplates>
-</file>
-
 <file path=customXml/itemProps1.xml><?xml version="1.0" encoding="utf-8"?>
-<ds:datastoreItem xmlns:ds="http://schemas.openxmlformats.org/officeDocument/2006/customXml" ds:itemID="{A0076ADD-E487-4CFE-9329-0DC435DD0A29}">
+<ds:datastoreItem xmlns:ds="http://schemas.openxmlformats.org/officeDocument/2006/customXml" ds:itemID="{5C20DEE7-0143-4D9B-AA48-FE209878969E}">
   <ds:schemaRefs>
-    <ds:schemaRef ds:uri="http://schemas.microsoft.com/office/2006/metadata/properties"/>
-    <ds:schemaRef ds:uri="http://schemas.microsoft.com/office/infopath/2007/PartnerControls"/>
+    <ds:schemaRef ds:uri="http://schemas.microsoft.com/sharepoint/v3/contenttype/forms"/>
   </ds:schemaRefs>
 </ds:datastoreItem>
 </file>
 
 <file path=customXml/itemProps2.xml><?xml version="1.0" encoding="utf-8"?>
+<ds:datastoreItem xmlns:ds="http://schemas.openxmlformats.org/officeDocument/2006/customXml" ds:itemID="{A0076ADD-E487-4CFE-9329-0DC435DD0A29}">
+  <ds:schemaRefs>
+    <ds:schemaRef ds:uri="http://schemas.microsoft.com/office/2006/metadata/properties"/>
+    <ds:schemaRef ds:uri="http://schemas.microsoft.com/office/infopath/2007/PartnerControls"/>
+    <ds:schemaRef ds:uri="46f3a809-46a3-44ee-a0f1-42a271529c86"/>
+    <ds:schemaRef ds:uri="69276225-f05c-44c5-92dc-c999460a4149"/>
+  </ds:schemaRefs>
+</ds:datastoreItem>
+</file>
+
+<file path=customXml/itemProps3.xml><?xml version="1.0" encoding="utf-8"?>
 <ds:datastoreItem xmlns:ds="http://schemas.openxmlformats.org/officeDocument/2006/customXml" ds:itemID="{F10C4B76-72F3-4A1E-BD59-1CC2C4675CAA}">
   <ds:schemaRefs>
     <ds:schemaRef ds:uri="http://schemas.openxmlformats.org/officeDocument/2006/bibliography"/>
@@ -20606,14 +22358,6 @@
 </ds:datastoreItem>
 </file>
 
-<file path=customXml/itemProps3.xml><?xml version="1.0" encoding="utf-8"?>
-<ds:datastoreItem xmlns:ds="http://schemas.openxmlformats.org/officeDocument/2006/customXml" ds:itemID="{9207DE4E-993F-46B8-A050-04C2DC36F840}"/>
-</file>
-
 <file path=customXml/itemProps4.xml><?xml version="1.0" encoding="utf-8"?>
-<ds:datastoreItem xmlns:ds="http://schemas.openxmlformats.org/officeDocument/2006/customXml" ds:itemID="{5C20DEE7-0143-4D9B-AA48-FE209878969E}">
-  <ds:schemaRefs>
-    <ds:schemaRef ds:uri="http://schemas.microsoft.com/sharepoint/v3/contenttype/forms"/>
-  </ds:schemaRefs>
-</ds:datastoreItem>
+<ds:datastoreItem xmlns:ds="http://schemas.openxmlformats.org/officeDocument/2006/customXml" ds:itemID="{14BEF991-F87B-4E98-9C25-D9FB6048BD43}"/>
 </file>
</xml_diff>